<commit_message>
Sync manuscript: review revisions (framing, definitions, clarity)
Materialist-transmission framing paragraph; prominent general-reader definitions
of "closure" (with the s scale) and "marker"; Figure 2 moved into the
Distinguishing section with an in-text reference; expanded co-seriability
explanation (Lipo, Madsen & Dunnell 2015); "generative" explained; "rarefaction"
-> "subsampling"; dramatic phrasings removed; Mark E. Madsen added to the author
list; Fig. 1 caption "Marker size" -> "Symbol size." Synced from the
mls-emergence source.
</commit_message>
<xml_diff>
--- a/docs/manuscript/SUPPLEMENTAL_TEXT.docx
+++ b/docs/manuscript/SUPPLEMENTAL_TEXT.docx
@@ -32,7 +32,7 @@
           <w:b/>
           <w:bCs/>
         </w:rPr>
-        <w:t xml:space="preserve">Carl P. Lipo and Robert J. DiNapoli</w:t>
+        <w:t xml:space="preserve">Carl P. Lipo, Robert J. DiNapoli, and Mark E. Madsen</w:t>
       </w:r>
     </w:p>
     <w:p>
@@ -1328,7 +1328,7 @@
         <w:pStyle w:val="FirstParagraph"/>
       </w:pPr>
       <w:r>
-        <w:t xml:space="preserve">The recovery experiment injects group closure as between-cluster divergence, which is what cultural F_ST measures, so a fair objection is that the experiment merely certifies an F_ST detector recovering an F_ST-shaped signal. We tested this by injecting closure through two further channels, each matched to a different signature, and asking which signature recovers each. A within-group conformity channel raises conformity in a single undivided pool with no between-group divergence, the channel that the neutral departure is built to detect. A non-spatial social channel assembles assemblages into social groups scrambled relative to the spatial clusters, the channel seriation coherence is built to detect. The result is one-sided, and in two ways. First, the conformity channel is recovered by no signature (the neutral departure, which should detect it, inverts rather than rises), and the non-spatial social channel is not recovered by seriation either. Hence, the neutral and seriation signatures fail to register an injected signal even through the channel each is designed for. Second, F_ST is not a clean spatial-divergence detector but a near-omnibus one, responding to group structure, however it is organized. It recovers the spatial-divergence channel strongly (mean trend rising from the null to +0.76 at strong injection) and also recovers the non-spatial social channel (+0.77), because both ultimately raise between-group variance somewhere the partition can see it. The four signatures are therefore not four independent channels, even in this diagnostic. The only one that registers an injected signal at this resolution is F_ST, and it does so for divergence. However, its signal is organized. The reduction to F_ST is a property of the record’s resolution, 29 time-averaged assemblages rarefied to a common count over ten aggregated types, not an artifact of a generator whose closure axis is collinear with F_ST. A rarefaction-depth sweep (the weak signatures climb modestly with more sherds but remain well below F_ST) and a cluster-count sweep (the spatial signature stays weak through k = 5) confirm that the limitation is the record’s size and time-averaging rather than a single tuning choice. The consequence, stated in the Discussion, is that the negative bounds only result in divergence-channel closure. A closure carried purely by conformity or by a non-spatially organized social structure is below detection here at any strength.</w:t>
+        <w:t xml:space="preserve">The recovery experiment injects group closure as between-cluster divergence, which is what cultural F_ST measures, so a fair objection is that the experiment merely certifies an F_ST detector recovering an F_ST-shaped signal. We tested this by injecting closure through two further channels, each matched to a different signature, and asking which signature recovers each. A within-group conformity channel raises conformity in a single undivided pool with no between-group divergence, the channel that the neutral departure is built to detect. A non-spatial social channel assembles assemblages into social groups scrambled relative to the spatial clusters, the channel seriation coherence is built to detect. The result is one-sided, and in two ways. First, the conformity channel is recovered by no signature (the neutral departure, which should detect it, inverts rather than rises), and the non-spatial social channel is not recovered by seriation either. Hence, the neutral and seriation signatures fail to register an injected signal even through the channel each is designed for. Second, F_ST is not a clean spatial-divergence detector but a near-omnibus one, responding to group structure, however it is organized. It recovers the spatial-divergence channel strongly (mean trend rising from the null to +0.76 at strong injection) and also recovers the non-spatial social channel (+0.77), because both ultimately raise between-group variance somewhere the partition can see it. The four signatures are therefore not four independent channels, even in this diagnostic. The only one that registers an injected signal at this resolution is F_ST, and it does so for divergence. However, its signal is organized. The reduction to F_ST is a property of the record’s resolution, 29 time-averaged assemblages subsampled to a common count over ten aggregated types, not an artifact of a generator whose closure axis is collinear with F_ST. A subsampling-depth sweep (the weak signatures climb modestly with more sherds but remain well below F_ST) and a cluster-count sweep (the spatial signature stays weak through k = 5) confirm that the limitation is the record’s size and time-averaging rather than a single tuning choice. The consequence, stated in the Discussion, is that the negative bounds only result in divergence-channel closure. A closure carried purely by conformity or by a non-spatially organized social structure is below detection here at any strength.</w:t>
       </w:r>
     </w:p>
     <w:bookmarkEnd w:id="18"/>
@@ -1355,7 +1355,7 @@
         <w:t xml:space="preserve">(2021)</w:t>
       </w:r>
       <w:r>
-        <w:t xml:space="preserve">. Each assemblage is a node holding a finite population of learners that copies decorated-type variants within the node and, at a low rate, from other nodes with a probability that decays with geographic distance, with innovation and the record’s trailing-window time-averaging imposed. We compared this neutral model against a bounded-groups model in which interactions are concentrated within spatially contiguous groups, with only a small leak between them, both run on the same coordinates and rarefied to the observed per-assemblage counts. We swept the interaction range (6, 12, and 24 km), the between-node mixing rate (0.02, 0.05, and 0.20), and the innovation rate (0.005, 0.01, and 0.02), in both snapshot and time-averaged form, at 100 seeds per cell, recording for each cell whether the four observed statistics fall inside the neutral null. Across the time-averaged sweep, the region that brackets all four at once is the low-mixing, sub-basin-range corner (24 km, mixing 0.02, innovation 0.01), as reported in Figure S5. At shorter ranges, drift over-produces the distance decay. At higher mixing, it underproduces the structure, so the all-four match holds only in a plausible but specific region of parameter space rather than across the whole parameter space. In every cell, the bounded-groups model overshoots the three structural statistics by roughly two to seven times relative to the observed values, so the contrast between drift, which can reproduce the data, and bounded groups, which cannot, is robust even where the all-four drift match is not. The control also demonstrates that the distance-controlled boundary excess, near zero under smooth deterministic isolation by distance, takes substantial positive values under stochastic neutral drift, so a positive boundary excess does not by itself distinguish a social boundary from drift on a finite network.</w:t>
+        <w:t xml:space="preserve">. Each assemblage is a node holding a finite population of learners that copies decorated-type variants within the node and, at a low rate, from other nodes with a probability that decays with geographic distance, with innovation and the record’s trailing-window time-averaging imposed. We compared this neutral model against a bounded-groups model in which interactions are concentrated within spatially contiguous groups, with only a small leak between them, both run on the same coordinates and subsampled to the observed per-assemblage counts. We swept the interaction range (6, 12, and 24 km), the between-node mixing rate (0.02, 0.05, and 0.20), and the innovation rate (0.005, 0.01, and 0.02), in both snapshot and time-averaged form, at 100 seeds per cell, recording for each cell whether the four observed statistics fall inside the neutral null. Across the time-averaged sweep, the region that brackets all four at once is the low-mixing, sub-basin-range corner (24 km, mixing 0.02, innovation 0.01), as reported in Figure S5. At shorter ranges, drift over-produces the distance decay. At higher mixing, it underproduces the structure, so the all-four match holds only in a plausible but specific region of parameter space rather than across the whole parameter space. In every cell, the bounded-groups model overshoots the three structural statistics by roughly two to seven times relative to the observed values, so the contrast between drift, which can reproduce the data, and bounded groups, which cannot, is robust even where the all-four drift match is not. The control also demonstrates that the distance-controlled boundary excess, near zero under smooth deterministic isolation by distance, takes substantial positive values under stochastic neutral drift, so a positive boundary excess does not by itself distinguish a social boundary from drift on a finite network.</w:t>
       </w:r>
     </w:p>
     <w:p>
@@ -1367,7 +1367,7 @@
           <wp:inline>
             <wp:extent cx="5334000" cy="3619056"/>
             <wp:effectExtent b="0" l="0" r="0" t="0"/>
-            <wp:docPr descr="Figure S5. Spatial drift versus bounded groups on the basin geography. Top: the four observed signatures (vertical lines) against the null distributions produced by a neutral spatial-drift model (blue) and a bounded-groups model (orange) on the real coordinate layout, both time-averaged and rarefied to the observed counts. Observed values fall inside the drift distribution and far below the bounded-groups distribution for modularity, boundary excess, and cultural F_ST. Bottom: multidimensional scaling of decorated dissimilarity for the observed assemblages and one realization of each model, spatial drift reproducing the weak, spatially blurred structure while bounded groups produce a sharper split than the data show." title="" id="20" name="Picture"/>
+            <wp:docPr descr="Figure S5. Spatial drift versus bounded groups on the basin geography. Top: the four observed signatures (vertical lines) against the null distributions produced by a neutral spatial-drift model (blue) and a bounded-groups model (orange) on the real coordinate layout, both time-averaged and subsampled to the observed counts. Observed values fall inside the drift distribution and far below the bounded-groups distribution for modularity, boundary excess, and cultural F_ST. Bottom: multidimensional scaling of decorated dissimilarity for the observed assemblages and one realization of each model, spatial drift reproducing the weak, spatially blurred structure while bounded groups produce a sharper split than the data show." title="" id="20" name="Picture"/>
             <a:graphic>
               <a:graphicData uri="http://schemas.openxmlformats.org/drawingml/2006/picture">
                 <pic:pic>
@@ -1420,7 +1420,7 @@
         <w:t xml:space="preserve"> </w:t>
       </w:r>
       <w:r>
-        <w:t xml:space="preserve">Spatial drift versus bounded groups on the basin geography. Top: the four observed signatures (vertical lines) against the null distributions produced by a neutral spatial-drift model (blue) and a bounded-groups model (orange) on the real coordinate layout, both time-averaged and rarefied to the observed counts. Observed values fall inside the drift distribution and far below the bounded-groups distribution for modularity, boundary excess, and cultural F_ST. Bottom: multidimensional scaling of decorated dissimilarity for the observed assemblages and one realization of each model, spatial drift reproducing the weak, spatially blurred structure while bounded groups produce a sharper split than the data show.</w:t>
+        <w:t xml:space="preserve">Spatial drift versus bounded groups on the basin geography. Top: the four observed signatures (vertical lines) against the null distributions produced by a neutral spatial-drift model (blue) and a bounded-groups model (orange) on the real coordinate layout, both time-averaged and subsampled to the observed counts. Observed values fall inside the drift distribution and far below the bounded-groups distribution for modularity, boundary excess, and cultural F_ST. Bottom: multidimensional scaling of decorated dissimilarity for the observed assemblages and one realization of each model, spatial drift reproducing the weak, spatially blurred structure while bounded groups produce a sharper split than the data show.</w:t>
       </w:r>
     </w:p>
     <w:bookmarkEnd w:id="22"/>

</xml_diff>

<commit_message>
Sync manuscript: SBC-calibrated ABC-SMC + hierarchical convergence in Supplemental; three-panel color Figure S6
</commit_message>
<xml_diff>
--- a/docs/manuscript/SUPPLEMENTAL_TEXT.docx
+++ b/docs/manuscript/SUPPLEMENTAL_TEXT.docx
@@ -2,7 +2,7 @@
 <file path=word/document.xml><?xml version="1.0" encoding="utf-8"?>
 <w:document xmlns:w="http://schemas.openxmlformats.org/wordprocessingml/2006/main" xmlns:m="http://schemas.openxmlformats.org/officeDocument/2006/math" xmlns:r="http://schemas.openxmlformats.org/officeDocument/2006/relationships" xmlns:o="urn:schemas-microsoft-com:office:office" xmlns:v="urn:schemas-microsoft-com:vml" xmlns:w10="urn:schemas-microsoft-com:office:word" xmlns:a="http://schemas.openxmlformats.org/drawingml/2006/main" xmlns:pic="http://schemas.openxmlformats.org/drawingml/2006/picture" xmlns:wp="http://schemas.openxmlformats.org/drawingml/2006/wordprocessingDrawing">
   <w:body>
-    <w:bookmarkStart w:id="91" w:name="supplemental-material"/>
+    <w:bookmarkStart w:id="97" w:name="supplemental-material"/>
     <w:p>
       <w:pPr>
         <w:pStyle w:val="Heading1"/>
@@ -1078,7 +1078,36 @@
         <w:pStyle w:val="BodyText"/>
       </w:pPr>
       <w:r>
-        <w:t xml:space="preserve">We combined the four signatures by standardizing each across the ordinal sequence and averaging them, so that no single signature would dominate, and summarized the trajectory as the ordinal slope of the combined score and each component, with rank correlations and bootstrap confidence intervals.</w:t>
+        <w:t xml:space="preserve">We combined the four signatures by standardizing each across the ordinal sequence and averaging them, so that no single signature would dominate, and summarized the trajectory as the ordinal slope of the combined score and each component, with rank correlations and bootstrap confidence intervals. A hierarchical Bayesian model of the four slopes, which pools them toward a shared trend and propagates each signature’s measurement uncertainty, puts the posterior probability that all four rise together at zero</w:t>
+      </w:r>
+      <w:r>
+        <w:t xml:space="preserve"> </w:t>
+      </w:r>
+      <w:r>
+        <w:t xml:space="preserve">(Salvatier et al. 2016)</w:t>
+      </w:r>
+      <w:r>
+        <w:t xml:space="preserve">, reinforcing the cultural-</w:t>
+      </w:r>
+      <m:oMath>
+        <m:sSub>
+          <m:e>
+            <m:r>
+              <m:t>F</m:t>
+            </m:r>
+          </m:e>
+          <m:sub>
+            <m:r>
+              <m:t>S</m:t>
+            </m:r>
+            <m:r>
+              <m:t>T</m:t>
+            </m:r>
+          </m:sub>
+        </m:sSub>
+      </m:oMath>
+      <w:r>
+        <w:t xml:space="preserve">-led reading rather than a convergence of the signatures.</w:t>
       </w:r>
     </w:p>
     <w:bookmarkEnd w:id="9"/>
@@ -1114,7 +1143,7 @@
         <w:t xml:space="preserve">(Henrich 2001)</w:t>
       </w:r>
       <w:r>
-        <w:t xml:space="preserve">), and a spatial rule placing group profiles on the landscape. Four generators instantiate the four idealized processes of Table 1, where drift is a single process that the main-text table shows under two regimes, smooth and stochastic, of which the smooth, deterministic regime is the one generated here. The bounded-groups generator raises divergence and conformity together across spatially bounded groups. Environmental patchiness holds a fixed between-group difference under neutral within-group copying with an environment-keyed layout. Aggregated signaling raises within-group conformity in a single undivided pool with no between-group divergence. Drift with distance-limited interaction produces a smooth spatial gradient under neutral copying. Each generator emits a sequence of group-by-class slices along an ordinal axis. We ran the four-signature procedure on each generator, blind to its source, and recorded which registered as convergent, repeating this across 500 random seeds. On the bounded-groups output we also computed the correlation matrix of the four signatures, to confirm that their joint movement is informative rather than an artifact of redundancy (Figure S1). This idealized test uses large, clean assemblages (12 groups, several hundred sherds each) and establishes that it discriminates in principle. The record-matched, size-controlled recovery in the main text (Figure 4) is what establishes which signatures survive at the resolution of the actual data.</w:t>
+        <w:t xml:space="preserve">), and a spatial rule placing group profiles on the landscape. Four generators instantiate the four idealized processes of Table 1, where drift is a single process that the main-text table shows under two regimes, smooth and stochastic, of which the smooth, deterministic regime is the one generated here. The bounded-groups generator raises divergence and conformity together across spatially bounded groups. Environmental patchiness holds a fixed between-group difference under neutral within-group copying with an environment-keyed layout. Aggregated conformity raises within-group conformity in a single undivided pool with no between-group divergence. Drift with distance-limited interaction produces a smooth spatial gradient under neutral copying. Each generator emits a sequence of group-by-class slices along an ordinal axis. We ran the four-signature procedure on each generator, blind to its source, and recorded which registered as convergent, repeating this across 500 random seeds. On the bounded-groups output we also computed the correlation matrix of the four signatures, to confirm that their joint movement is informative rather than an artifact of redundancy (Figure S1). This idealized test uses large, clean assemblages (12 groups, several hundred sherds each) and establishes that it discriminates in principle. The record-matched, size-controlled recovery in the main text (Figure 4) is what establishes which signatures survive at the resolution of the actual data.</w:t>
       </w:r>
     </w:p>
     <w:p>
@@ -1320,7 +1349,30 @@
         <w:pStyle w:val="Heading2"/>
       </w:pPr>
       <w:r>
-        <w:t xml:space="preserve">The F_ST-led reduction is a property of the record, not the generator</w:t>
+        <w:t xml:space="preserve">The</w:t>
+      </w:r>
+      <w:r>
+        <w:t xml:space="preserve"> </w:t>
+      </w:r>
+      <m:oMath>
+        <m:sSub>
+          <m:e>
+            <m:r>
+              <m:t>F</m:t>
+            </m:r>
+          </m:e>
+          <m:sub>
+            <m:r>
+              <m:t>S</m:t>
+            </m:r>
+            <m:r>
+              <m:t>T</m:t>
+            </m:r>
+          </m:sub>
+        </m:sSub>
+      </m:oMath>
+      <w:r>
+        <w:t xml:space="preserve">-led reduction is a property of the record, not the generator</w:t>
       </w:r>
     </w:p>
     <w:p>
@@ -1328,7 +1380,203 @@
         <w:pStyle w:val="FirstParagraph"/>
       </w:pPr>
       <w:r>
-        <w:t xml:space="preserve">The recovery experiment injects group closure as between-cluster divergence, which is what cultural F_ST measures, so one objection is that the experiment only certifies an F_ST test recovering an F_ST-shaped signal. We tested this by injecting closure through two further pathways, each matched to a different signature, and asking which signature recovers each. A within-group conformity pathway raises conformity in a single undivided pool with no between-group divergence, the pathway that the neutral departure is meant to detect. A non-spatial social pathway assembles assemblages into social groups scrambled relative to the spatial clusters, the pathway seriation coherence is meant to detect. The result is one-sided in two ways. First, the conformity pathway is recovered by no signature (the neutral departure, which should detect it, inverts rather than rises), and the non-spatial social pathway is not recovered by seriation either. Hence, the neutral and seriation signatures fail to register an injected signal even through the pathway each is designed for. Second, F_ST is not a clean spatial-divergence test but a near-omnibus one, responding to group structure, however it is organized. It recovers the spatial-divergence pathway strongly (mean trend rising from the null to +0.76 at strong injection) and also recovers the non-spatial social pathway (+0.77), because both ultimately raise between-group variance somewhere the partition can see it. The four signatures are therefore not four independent pathways, even in this diagnostic. The only one that registers an injected signal at this resolution is F_ST, and it does so however the underlying divergence is organized. The reduction to F_ST is a property of the record’s resolution, not an artifact of a generator whose injected closure is collinear with F_ST. That resolution is 29 time-averaged assemblages subsampled to a common count over ten aggregated classes. A subsampling-depth sweep (the weak signatures climb modestly with more sherds but remain well below F_ST) and a cluster-count sweep (the spatial signature stays weak through k = 5) confirm that the limitation is the record’s size and time-averaging rather than a single tuning choice. The consequence, stated in the Discussion, is that the negative bounds only cover closure expressed as between-group divergence. A closure carried purely by conformity or by a non-spatially organized social structure is below detection here at any strength.</w:t>
+        <w:t xml:space="preserve">The recovery experiment injects group closure as between-cluster divergence, which is what cultural</w:t>
+      </w:r>
+      <w:r>
+        <w:t xml:space="preserve"> </w:t>
+      </w:r>
+      <m:oMath>
+        <m:sSub>
+          <m:e>
+            <m:r>
+              <m:t>F</m:t>
+            </m:r>
+          </m:e>
+          <m:sub>
+            <m:r>
+              <m:t>S</m:t>
+            </m:r>
+            <m:r>
+              <m:t>T</m:t>
+            </m:r>
+          </m:sub>
+        </m:sSub>
+      </m:oMath>
+      <w:r>
+        <w:t xml:space="preserve"> </w:t>
+      </w:r>
+      <w:r>
+        <w:t xml:space="preserve">measures, so one objection is that the experiment only certifies an</w:t>
+      </w:r>
+      <w:r>
+        <w:t xml:space="preserve"> </w:t>
+      </w:r>
+      <m:oMath>
+        <m:sSub>
+          <m:e>
+            <m:r>
+              <m:t>F</m:t>
+            </m:r>
+          </m:e>
+          <m:sub>
+            <m:r>
+              <m:t>S</m:t>
+            </m:r>
+            <m:r>
+              <m:t>T</m:t>
+            </m:r>
+          </m:sub>
+        </m:sSub>
+      </m:oMath>
+      <w:r>
+        <w:t xml:space="preserve"> </w:t>
+      </w:r>
+      <w:r>
+        <w:t xml:space="preserve">test recovering an</w:t>
+      </w:r>
+      <w:r>
+        <w:t xml:space="preserve"> </w:t>
+      </w:r>
+      <m:oMath>
+        <m:sSub>
+          <m:e>
+            <m:r>
+              <m:t>F</m:t>
+            </m:r>
+          </m:e>
+          <m:sub>
+            <m:r>
+              <m:t>S</m:t>
+            </m:r>
+            <m:r>
+              <m:t>T</m:t>
+            </m:r>
+          </m:sub>
+        </m:sSub>
+      </m:oMath>
+      <w:r>
+        <w:t xml:space="preserve">-shaped signal. We tested this by injecting closure through two further pathways, each matched to a different signature, and asking which signature recovers each. A within-group conformity pathway raises conformity in a single undivided pool with no between-group divergence, the pathway that the neutral departure is meant to detect. A non-spatial social pathway assembles assemblages into social groups scrambled relative to the spatial clusters, the pathway seriation coherence is meant to detect. The result is one-sided in two ways. First, the conformity pathway is recovered by no signature (the neutral departure, which should detect it, inverts rather than rises), and the non-spatial social pathway is not recovered by seriation either. Hence, the neutral and seriation signatures fail to register an injected signal even through the pathway each is designed for. Second,</w:t>
+      </w:r>
+      <w:r>
+        <w:t xml:space="preserve"> </w:t>
+      </w:r>
+      <m:oMath>
+        <m:sSub>
+          <m:e>
+            <m:r>
+              <m:t>F</m:t>
+            </m:r>
+          </m:e>
+          <m:sub>
+            <m:r>
+              <m:t>S</m:t>
+            </m:r>
+            <m:r>
+              <m:t>T</m:t>
+            </m:r>
+          </m:sub>
+        </m:sSub>
+      </m:oMath>
+      <w:r>
+        <w:t xml:space="preserve"> </w:t>
+      </w:r>
+      <w:r>
+        <w:t xml:space="preserve">is not a clean spatial-divergence test but a near-omnibus one, responding to group structure, however it is organized. It recovers the spatial-divergence pathway strongly (mean trend rising from the null to +0.76 at strong injection) and also recovers the non-spatial social pathway (+0.77), because both ultimately raise between-group variance somewhere the partition can see it. The four signatures are therefore not four independent pathways, even in this diagnostic. The only one that registers an injected signal at this resolution is</w:t>
+      </w:r>
+      <w:r>
+        <w:t xml:space="preserve"> </w:t>
+      </w:r>
+      <m:oMath>
+        <m:sSub>
+          <m:e>
+            <m:r>
+              <m:t>F</m:t>
+            </m:r>
+          </m:e>
+          <m:sub>
+            <m:r>
+              <m:t>S</m:t>
+            </m:r>
+            <m:r>
+              <m:t>T</m:t>
+            </m:r>
+          </m:sub>
+        </m:sSub>
+      </m:oMath>
+      <w:r>
+        <w:t xml:space="preserve">, and it does so however the underlying divergence is organized. The reduction to</w:t>
+      </w:r>
+      <w:r>
+        <w:t xml:space="preserve"> </w:t>
+      </w:r>
+      <m:oMath>
+        <m:sSub>
+          <m:e>
+            <m:r>
+              <m:t>F</m:t>
+            </m:r>
+          </m:e>
+          <m:sub>
+            <m:r>
+              <m:t>S</m:t>
+            </m:r>
+            <m:r>
+              <m:t>T</m:t>
+            </m:r>
+          </m:sub>
+        </m:sSub>
+      </m:oMath>
+      <w:r>
+        <w:t xml:space="preserve"> </w:t>
+      </w:r>
+      <w:r>
+        <w:t xml:space="preserve">is a property of the record’s resolution, not an artifact of a generator whose injected closure is collinear with</w:t>
+      </w:r>
+      <w:r>
+        <w:t xml:space="preserve"> </w:t>
+      </w:r>
+      <m:oMath>
+        <m:sSub>
+          <m:e>
+            <m:r>
+              <m:t>F</m:t>
+            </m:r>
+          </m:e>
+          <m:sub>
+            <m:r>
+              <m:t>S</m:t>
+            </m:r>
+            <m:r>
+              <m:t>T</m:t>
+            </m:r>
+          </m:sub>
+        </m:sSub>
+      </m:oMath>
+      <w:r>
+        <w:t xml:space="preserve">. That resolution is 29 time-averaged assemblages subsampled to a common count over ten aggregated classes. A subsampling-depth sweep (the weak signatures climb modestly with more sherds but remain well below</w:t>
+      </w:r>
+      <w:r>
+        <w:t xml:space="preserve"> </w:t>
+      </w:r>
+      <m:oMath>
+        <m:sSub>
+          <m:e>
+            <m:r>
+              <m:t>F</m:t>
+            </m:r>
+          </m:e>
+          <m:sub>
+            <m:r>
+              <m:t>S</m:t>
+            </m:r>
+            <m:r>
+              <m:t>T</m:t>
+            </m:r>
+          </m:sub>
+        </m:sSub>
+      </m:oMath>
+      <w:r>
+        <w:t xml:space="preserve">) and a cluster-count sweep (the spatial signature stays weak through k = 5) confirm that the limitation is the record’s size and time-averaging rather than a single tuning choice. The consequence, stated in the Discussion, is that the negative bounds only cover closure expressed as between-group divergence. A closure carried purely by conformity or by a non-spatially organized social structure is below detection here at any strength.</w:t>
       </w:r>
     </w:p>
     <w:bookmarkEnd w:id="18"/>
@@ -1367,7 +1615,7 @@
           <wp:inline>
             <wp:extent cx="5334000" cy="3619056"/>
             <wp:effectExtent b="0" l="0" r="0" t="0"/>
-            <wp:docPr descr="Figure S3. Spatial drift versus bounded groups on the basin geography. Top: the four observed signatures (vertical lines) against the null distributions produced by a neutral spatial-drift model (blue) and a bounded-groups model (orange) on the real coordinate layout, both time-averaged and subsampled to the observed counts. Observed values fall inside the drift distribution and far below the bounded-groups distribution for modularity, boundary excess, and cultural F_ST. Bottom: multidimensional scaling of decorated dissimilarity for the observed assemblages and one realization of each model, spatial drift reproducing the weak, spatially blurred structure while bounded groups produce a sharper split than the data show." title="" id="20" name="Picture"/>
+            <wp:docPr descr="Figure S3. Spatial drift versus bounded groups on the basin geography. Top: the four observed signatures (vertical lines) against the null distributions produced by a neutral spatial-drift model (blue) and a bounded-groups model (orange) on the real coordinate layout, both time-averaged and subsampled to the observed counts. Observed values fall inside the drift distribution and far below the bounded-groups distribution for modularity, boundary excess, and cultural F_{ST}. Bottom: multidimensional scaling of decorated dissimilarity for the observed assemblages and one realization of each model, spatial drift reproducing the weak, spatially blurred structure while bounded groups produce a sharper split than the data show." title="" id="20" name="Picture"/>
             <a:graphic>
               <a:graphicData uri="http://schemas.openxmlformats.org/drawingml/2006/picture">
                 <pic:pic>
@@ -1420,7 +1668,30 @@
         <w:t xml:space="preserve"> </w:t>
       </w:r>
       <w:r>
-        <w:t xml:space="preserve">Spatial drift versus bounded groups on the basin geography. Top: the four observed signatures (vertical lines) against the null distributions produced by a neutral spatial-drift model (blue) and a bounded-groups model (orange) on the real coordinate layout, both time-averaged and subsampled to the observed counts. Observed values fall inside the drift distribution and far below the bounded-groups distribution for modularity, boundary excess, and cultural F_ST. Bottom: multidimensional scaling of decorated dissimilarity for the observed assemblages and one realization of each model, spatial drift reproducing the weak, spatially blurred structure while bounded groups produce a sharper split than the data show.</w:t>
+        <w:t xml:space="preserve">Spatial drift versus bounded groups on the basin geography. Top: the four observed signatures (vertical lines) against the null distributions produced by a neutral spatial-drift model (blue) and a bounded-groups model (orange) on the real coordinate layout, both time-averaged and subsampled to the observed counts. Observed values fall inside the drift distribution and far below the bounded-groups distribution for modularity, boundary excess, and cultural</w:t>
+      </w:r>
+      <w:r>
+        <w:t xml:space="preserve"> </w:t>
+      </w:r>
+      <m:oMath>
+        <m:sSub>
+          <m:e>
+            <m:r>
+              <m:t>F</m:t>
+            </m:r>
+          </m:e>
+          <m:sub>
+            <m:r>
+              <m:t>S</m:t>
+            </m:r>
+            <m:r>
+              <m:t>T</m:t>
+            </m:r>
+          </m:sub>
+        </m:sSub>
+      </m:oMath>
+      <w:r>
+        <w:t xml:space="preserve">. Bottom: multidimensional scaling of decorated dissimilarity for the observed assemblages and one realization of each model, spatial drift reproducing the weak, spatially blurred structure while bounded groups produce a sharper split than the data show.</w:t>
       </w:r>
     </w:p>
     <w:bookmarkEnd w:id="22"/>
@@ -1455,7 +1726,33 @@
         <w:pStyle w:val="BodyText"/>
       </w:pPr>
       <w:r>
-        <w:t xml:space="preserve">Interaction in this riverine settlement system travels along watercourses, so the copying kernel uses river-network distance rather than straight-line distance. We build a graph from the mapped hydrography (the LMVHydrology centerlines clipped to the basin with a 25 km margin), repair its topology by bridging vertices within 250 m of one another, keep the largest connected component, and snap each assemblage to the nearest network node, adding the snap distance as an access cost at both ends. The distance between two assemblages is the shortest along-water path between their snapped nodes. All 29 assemblages connect on the resulting network, the mean access distance from an assemblage to a mapped channel is 3.1 km, and along-water paths average about 2.3 times the straight-line distance. Substituting straight-line distance changes the results negligibly (between-group F_ST and community counts shift within sampling error), so the conclusions do not depend on the choice. We use river-network distance because it more faithfully represents how potters in the basin could interact. The same construction over all 55 lower-valley assemblages yields a single connected network for the wider-valley analyses (maximum access 19.6 km).</w:t>
+        <w:t xml:space="preserve">Interaction in this riverine settlement system travels along watercourses, so the copying kernel uses river-network distance rather than straight-line distance. We build a graph from the mapped hydrography (the LMVHydrology centerlines clipped to the basin with a 25 km margin), repair its topology by bridging vertices within 250 m of one another, keep the largest connected component, and snap each assemblage to the nearest network node, adding the snap distance as an access cost at both ends. The distance between two assemblages is the shortest along-water path between their snapped nodes. All 29 assemblages connect on the resulting network, the mean access distance from an assemblage to a mapped channel is 3.1 km, and along-water paths average about 2.3 times the straight-line distance. Substituting straight-line distance changes the results negligibly (between-group</w:t>
+      </w:r>
+      <w:r>
+        <w:t xml:space="preserve"> </w:t>
+      </w:r>
+      <m:oMath>
+        <m:sSub>
+          <m:e>
+            <m:r>
+              <m:t>F</m:t>
+            </m:r>
+          </m:e>
+          <m:sub>
+            <m:r>
+              <m:t>S</m:t>
+            </m:r>
+            <m:r>
+              <m:t>T</m:t>
+            </m:r>
+          </m:sub>
+        </m:sSub>
+      </m:oMath>
+      <w:r>
+        <w:t xml:space="preserve"> </w:t>
+      </w:r>
+      <w:r>
+        <w:t xml:space="preserve">and community counts shift within sampling error), so the conclusions do not depend on the choice. We use river-network distance because it more faithfully represents how potters in the basin could interact. The same construction over all 55 lower-valley assemblages yields a single connected network for the wider-valley analyses (maximum access 19.6 km).</w:t>
       </w:r>
     </w:p>
     <w:p>
@@ -1463,7 +1760,33 @@
         <w:pStyle w:val="BodyText"/>
       </w:pPr>
       <w:r>
-        <w:t xml:space="preserve">The assemblages are not contemporaneous, which is both why they can be seriated and why some carry more of the late classes than others, so the evolving field is sampled time-transgressively rather than at a single instant. The field is recorded at 90 evenly spaced time slices over 1,800 generations. Each synthetic assemblage is drawn from the slice that matches its observed seriation position, its rank on the first correspondence-analysis axis of the real data. It is accumulated over a trailing window of eight slices so that, like a real death assemblage, it mixes production across its span. Each synthetic assemblage is then sampled to the observed sherd count of the corresponding real assemblage. The synthetic assemblages are treated exactly as the empirical ones: interaction communities by the same modularity partition, between-group cultural F_ST on the resulting groups, and a seriation order from a fresh correspondence analysis. A contemporaneous control, with every assemblage drawn from the final slice, is sampled the same way for comparison.</w:t>
+        <w:t xml:space="preserve">The assemblages are not contemporaneous, which is both why they can be seriated and why some carry more of the late classes than others, so the evolving field is sampled time-transgressively rather than at a single instant. The field is recorded at 90 evenly spaced time slices over 1,800 generations. Each synthetic assemblage is drawn from the slice that matches its observed seriation position, its rank on the first correspondence-analysis axis of the real data. It is accumulated over a trailing window of eight slices so that, like a real death assemblage, it mixes production across its span. Each synthetic assemblage is then sampled to the observed sherd count of the corresponding real assemblage. The synthetic assemblages are treated exactly as the empirical ones: interaction communities by the same modularity partition, between-group cultural</w:t>
+      </w:r>
+      <w:r>
+        <w:t xml:space="preserve"> </w:t>
+      </w:r>
+      <m:oMath>
+        <m:sSub>
+          <m:e>
+            <m:r>
+              <m:t>F</m:t>
+            </m:r>
+          </m:e>
+          <m:sub>
+            <m:r>
+              <m:t>S</m:t>
+            </m:r>
+            <m:r>
+              <m:t>T</m:t>
+            </m:r>
+          </m:sub>
+        </m:sSub>
+      </m:oMath>
+      <w:r>
+        <w:t xml:space="preserve"> </w:t>
+      </w:r>
+      <w:r>
+        <w:t xml:space="preserve">on the resulting groups, and a seriation order from a fresh correspondence analysis. A contemporaneous control, with every assemblage drawn from the final slice, is sampled the same way for comparison.</w:t>
       </w:r>
     </w:p>
     <w:p>
@@ -1483,7 +1806,7 @@
           <wp:inline>
             <wp:extent cx="5334000" cy="4248345"/>
             <wp:effectExtent b="0" l="0" r="0" t="0"/>
-            <wp:docPr descr="Figure S4. Basin positive control: phase-like structure generated by neutral drift on the 29 St. Francis basin assemblages, with no bounded group imposed, over 500 realizations. (A) Each assemblage is shaded by the probability that it shares Parkin’s drift-detected group (star) under the contemporaneous snapshot that isolates the spatial signal. The probability falls off smoothly with river distance from Parkin (Spearman rho = -0.72), from about 0.70 nearby to 0.17 far away, so Parkin’s “phase” is a graded, probabilistic field rather than a bounded set. (B) Between-group cultural F_ST for the observed data (0.04) against contemporaneous and time-transgressive drift (medians with 95% intervals across the 500 runs). The observed value falls within the contemporaneous-drift interval, with 7.4% of drift runs reaching or exceeding it, so drift reproduces the observed level rather than the higher value a bounded group would leave." title="" id="24" name="Picture"/>
+            <wp:docPr descr="Figure S4. Basin positive control: phase-like structure generated by neutral drift on the 29 St. Francis basin assemblages, with no bounded group imposed, over 500 realizations. (A) Each assemblage is shaded by the probability that it shares Parkin’s drift-detected group (star) under the contemporaneous snapshot that isolates the spatial signal. The probability falls off smoothly with river distance from Parkin (Spearman rho = -0.72), from about 0.70 nearby to 0.17 far away, so Parkin’s “phase” is a graded, probabilistic field rather than a bounded set. (B) Between-group cultural F_{ST} for the observed data (0.04) against contemporaneous and time-transgressive drift (medians with 95% intervals across the 500 runs). The observed value falls within the contemporaneous-drift interval, with 7.4% of drift runs reaching or exceeding it, so drift reproduces the observed level rather than the higher value a bounded group would leave." title="" id="24" name="Picture"/>
             <a:graphic>
               <a:graphicData uri="http://schemas.openxmlformats.org/drawingml/2006/picture">
                 <pic:pic>
@@ -1548,7 +1871,33 @@
         <w:t xml:space="preserve"> </w:t>
       </w:r>
       <w:r>
-        <w:t xml:space="preserve">is a graded, probabilistic field rather than a bounded set. (B) Between-group cultural F_ST for the observed data (0.04) against contemporaneous and time-transgressive drift (medians with 95% intervals across the 500 runs). The observed value falls within the contemporaneous-drift interval, with 7.4% of drift runs reaching or exceeding it, so drift reproduces the observed level rather than the higher value a bounded group would leave.</w:t>
+        <w:t xml:space="preserve">is a graded, probabilistic field rather than a bounded set. (B) Between-group cultural</w:t>
+      </w:r>
+      <w:r>
+        <w:t xml:space="preserve"> </w:t>
+      </w:r>
+      <m:oMath>
+        <m:sSub>
+          <m:e>
+            <m:r>
+              <m:t>F</m:t>
+            </m:r>
+          </m:e>
+          <m:sub>
+            <m:r>
+              <m:t>S</m:t>
+            </m:r>
+            <m:r>
+              <m:t>T</m:t>
+            </m:r>
+          </m:sub>
+        </m:sSub>
+      </m:oMath>
+      <w:r>
+        <w:t xml:space="preserve"> </w:t>
+      </w:r>
+      <w:r>
+        <w:t xml:space="preserve">for the observed data (0.04) against contemporaneous and time-transgressive drift (medians with 95% intervals across the 500 runs). The observed value falls within the contemporaneous-drift interval, with 7.4% of drift runs reaching or exceeding it, so drift reproduces the observed level rather than the higher value a bounded group would leave.</w:t>
       </w:r>
     </w:p>
     <w:bookmarkEnd w:id="26"/>
@@ -1566,7 +1915,59 @@
         <w:pStyle w:val="FirstParagraph"/>
       </w:pPr>
       <w:r>
-        <w:t xml:space="preserve">The positive control shows the observed structure falls inside the drift distribution. The wider-valley demonstration (Figure 8) goes further, generating phase-like structure from drift on the real geography, and we checked that this result is not contingent on a single stochastic draw or a tuned parameter set. We repeated the time-transgressive drift experiment across 432 runs spanning a grid of interaction length (12, 18, 24, and 36 river-km), between-node mixing (0.01, 0.02, and 0.05), and innovation rate (0.006, 0.012, and 0.024), with twelve seeds per cell (Figure S5). Two or more spatially coherent groups, the phase-like territories a culture historian would name, appear in 431 of the 432 runs. The between-group cultural F_ST sits at or below the observed value in 85 percent of runs and within a factor of two of it in 53 percent, short of the bounded-groups expectation throughout. F_ST is essentially flat across interaction length and declines with more mixing or more innovation, the expected behavior of a drift process. The synthetic record re-seriates across the full grid (mean absolute Spearman correlation 0.44 between recovered and imposed order). The appearance of phase-like structure at the observed magnitude is therefore a generic outcome of distance-structured drift on this geography rather than a product of the chosen parameters.</w:t>
+        <w:t xml:space="preserve">The positive control shows the observed structure falls inside the drift distribution. The wider-valley demonstration (Figure 8) goes further, generating phase-like structure from drift on the real geography, and we checked that this result is not contingent on a single stochastic draw or a tuned parameter set. We repeated the time-transgressive drift experiment across 432 runs spanning a grid of interaction length (12, 18, 24, and 36 river-km), between-node mixing (0.01, 0.02, and 0.05), and innovation rate (0.006, 0.012, and 0.024), with twelve seeds per cell (Figure S5). Two or more spatially coherent groups, the phase-like territories a culture historian would name, appear in 431 of the 432 runs. The between-group cultural</w:t>
+      </w:r>
+      <w:r>
+        <w:t xml:space="preserve"> </w:t>
+      </w:r>
+      <m:oMath>
+        <m:sSub>
+          <m:e>
+            <m:r>
+              <m:t>F</m:t>
+            </m:r>
+          </m:e>
+          <m:sub>
+            <m:r>
+              <m:t>S</m:t>
+            </m:r>
+            <m:r>
+              <m:t>T</m:t>
+            </m:r>
+          </m:sub>
+        </m:sSub>
+      </m:oMath>
+      <w:r>
+        <w:t xml:space="preserve"> </w:t>
+      </w:r>
+      <w:r>
+        <w:t xml:space="preserve">sits at or below the observed value in 85 percent of runs and within a factor of two of it in 53 percent, short of the bounded-groups expectation throughout.</w:t>
+      </w:r>
+      <w:r>
+        <w:t xml:space="preserve"> </w:t>
+      </w:r>
+      <m:oMath>
+        <m:sSub>
+          <m:e>
+            <m:r>
+              <m:t>F</m:t>
+            </m:r>
+          </m:e>
+          <m:sub>
+            <m:r>
+              <m:t>S</m:t>
+            </m:r>
+            <m:r>
+              <m:t>T</m:t>
+            </m:r>
+          </m:sub>
+        </m:sSub>
+      </m:oMath>
+      <w:r>
+        <w:t xml:space="preserve"> </w:t>
+      </w:r>
+      <w:r>
+        <w:t xml:space="preserve">is essentially flat across interaction length and declines with more mixing or more innovation, the expected behavior of a drift process. The synthetic record re-seriates across the full grid (mean absolute Spearman correlation 0.44 between recovered and imposed order). The appearance of phase-like structure at the observed magnitude is therefore a generic outcome of distance-structured drift on this geography rather than a product of the chosen parameters.</w:t>
       </w:r>
     </w:p>
     <w:p>
@@ -1576,9 +1977,9 @@
       <w:r>
         <w:drawing>
           <wp:inline>
-            <wp:extent cx="5334000" cy="4112375"/>
+            <wp:extent cx="5334000" cy="4107231"/>
             <wp:effectExtent b="0" l="0" r="0" t="0"/>
-            <wp:docPr descr="Figure S5. Robustness of phase-like grouping to contingency and model factors, across 432 time-transgressive runs (a grid of interaction length, between-node mixing, and innovation rate, twelve seeds per cell). (A) Between-group cultural F_ST by between-node mixing and (B) by innovation rate, boxes taken over all other factors and seeds. The observed value (dashed) is bracketed, and F_ST falls with both factors but never reaches the bounded-groups level. (C) Distribution of the number of drift-detected groups per run, with 431 of the 432 runs (99.8 percent) yielding two or more. (D) Distribution of seriation recovery, the absolute Spearman correlation between the recovered CA1 rank and the imposed time order, across runs (mean 0.44)." title="" id="28" name="Picture"/>
+            <wp:docPr descr="Figure S5. Robustness of phase-like grouping to contingency and model factors, across 432 time-transgressive runs (a grid of interaction length, between-node mixing, and innovation rate, twelve seeds per cell). (A) Between-group cultural F_{ST} by between-node mixing and (B) by innovation rate, boxes taken over all other factors and seeds. The observed value (dashed) is bracketed, and F_{ST} falls with both factors but never reaches the bounded-groups level. (C) Distribution of the number of drift-detected groups per run, with 431 of the 432 runs (99.8 percent) yielding two or more. (D) Distribution of seriation recovery, the absolute Spearman correlation between the recovered CA1 rank and the imposed time order, across runs (mean 0.44)." title="" id="28" name="Picture"/>
             <a:graphic>
               <a:graphicData uri="http://schemas.openxmlformats.org/drawingml/2006/picture">
                 <pic:pic>
@@ -1597,7 +1998,7 @@
                   <pic:spPr bwMode="auto">
                     <a:xfrm>
                       <a:off x="0" y="0"/>
-                      <a:ext cx="5334000" cy="4112375"/>
+                      <a:ext cx="5334000" cy="4107231"/>
                     </a:xfrm>
                     <a:prstGeom prst="rect">
                       <a:avLst/>
@@ -1631,7 +2032,59 @@
         <w:t xml:space="preserve"> </w:t>
       </w:r>
       <w:r>
-        <w:t xml:space="preserve">Robustness of phase-like grouping to contingency and model factors, across 432 time-transgressive runs (a grid of interaction length, between-node mixing, and innovation rate, twelve seeds per cell). (A) Between-group cultural F_ST by between-node mixing and (B) by innovation rate, boxes taken over all other factors and seeds. The observed value (dashed) is bracketed, and F_ST falls with both factors but never reaches the bounded-groups level. (C) Distribution of the number of drift-detected groups per run, with 431 of the 432 runs (99.8 percent) yielding two or more. (D) Distribution of seriation recovery, the absolute Spearman correlation between the recovered CA1 rank and the imposed time order, across runs (mean 0.44).</w:t>
+        <w:t xml:space="preserve">Robustness of phase-like grouping to contingency and model factors, across 432 time-transgressive runs (a grid of interaction length, between-node mixing, and innovation rate, twelve seeds per cell). (A) Between-group cultural</w:t>
+      </w:r>
+      <w:r>
+        <w:t xml:space="preserve"> </w:t>
+      </w:r>
+      <m:oMath>
+        <m:sSub>
+          <m:e>
+            <m:r>
+              <m:t>F</m:t>
+            </m:r>
+          </m:e>
+          <m:sub>
+            <m:r>
+              <m:t>S</m:t>
+            </m:r>
+            <m:r>
+              <m:t>T</m:t>
+            </m:r>
+          </m:sub>
+        </m:sSub>
+      </m:oMath>
+      <w:r>
+        <w:t xml:space="preserve"> </w:t>
+      </w:r>
+      <w:r>
+        <w:t xml:space="preserve">by between-node mixing and (B) by innovation rate, boxes taken over all other factors and seeds. The observed value (dashed) is bracketed, and</w:t>
+      </w:r>
+      <w:r>
+        <w:t xml:space="preserve"> </w:t>
+      </w:r>
+      <m:oMath>
+        <m:sSub>
+          <m:e>
+            <m:r>
+              <m:t>F</m:t>
+            </m:r>
+          </m:e>
+          <m:sub>
+            <m:r>
+              <m:t>S</m:t>
+            </m:r>
+            <m:r>
+              <m:t>T</m:t>
+            </m:r>
+          </m:sub>
+        </m:sSub>
+      </m:oMath>
+      <w:r>
+        <w:t xml:space="preserve"> </w:t>
+      </w:r>
+      <w:r>
+        <w:t xml:space="preserve">falls with both factors but never reaches the bounded-groups level. (C) Distribution of the number of drift-detected groups per run, with 431 of the 432 runs (99.8 percent) yielding two or more. (D) Distribution of seriation recovery, the absolute Spearman correlation between the recovered CA1 rank and the imposed time order, across runs (mean 0.44).</w:t>
       </w:r>
     </w:p>
     <w:bookmarkEnd w:id="30"/>
@@ -1658,7 +2111,85 @@
         <w:t xml:space="preserve">(1954)</w:t>
       </w:r>
       <w:r>
-        <w:t xml:space="preserve">, comprising 50 assemblages from 28 sites, digitized from the survey tables and georeferenced using the Lower Mississippi Survey grid. Williams divided these lowlands into four named Mississippian phases. Across the named physiographic regions the cultural F_ST is 0.11. Most of that differentiation is a Woodland-to-Mississippian composition gradient rather than synchronic social structure. Restricting the analysis to Mississippian classes collapses the F_ST to 0.03, near the drift level. Within the region the assemblages do not separate into bounded clusters. They intermix on the ordination, and the between-cluster F_ST sits at the neutral-drift expectation and far below the bounded-groups null (Figure 11). Williams’s southeast-Missouri phases, like the named phases of the St. Francis basin, are arbitrary divisions of a continuous field structured by geography and time. This is the same verdict Fox</w:t>
+        <w:t xml:space="preserve">, comprising 50 assemblages from 28 sites, digitized from the survey tables and georeferenced using the Lower Mississippi Survey grid. Williams divided these lowlands into four named Mississippian phases. Across the named physiographic regions the cultural</w:t>
+      </w:r>
+      <w:r>
+        <w:t xml:space="preserve"> </w:t>
+      </w:r>
+      <m:oMath>
+        <m:sSub>
+          <m:e>
+            <m:r>
+              <m:t>F</m:t>
+            </m:r>
+          </m:e>
+          <m:sub>
+            <m:r>
+              <m:t>S</m:t>
+            </m:r>
+            <m:r>
+              <m:t>T</m:t>
+            </m:r>
+          </m:sub>
+        </m:sSub>
+      </m:oMath>
+      <w:r>
+        <w:t xml:space="preserve"> </w:t>
+      </w:r>
+      <w:r>
+        <w:t xml:space="preserve">is 0.11. Most of that differentiation is a Woodland-to-Mississippian composition gradient rather than synchronic social structure. Restricting the analysis to Mississippian classes collapses the</w:t>
+      </w:r>
+      <w:r>
+        <w:t xml:space="preserve"> </w:t>
+      </w:r>
+      <m:oMath>
+        <m:sSub>
+          <m:e>
+            <m:r>
+              <m:t>F</m:t>
+            </m:r>
+          </m:e>
+          <m:sub>
+            <m:r>
+              <m:t>S</m:t>
+            </m:r>
+            <m:r>
+              <m:t>T</m:t>
+            </m:r>
+          </m:sub>
+        </m:sSub>
+      </m:oMath>
+      <w:r>
+        <w:t xml:space="preserve"> </w:t>
+      </w:r>
+      <w:r>
+        <w:t xml:space="preserve">to 0.03, near the drift level. Within the region the assemblages do not separate into bounded clusters. They intermix on the ordination, and the between-cluster</w:t>
+      </w:r>
+      <w:r>
+        <w:t xml:space="preserve"> </w:t>
+      </w:r>
+      <m:oMath>
+        <m:sSub>
+          <m:e>
+            <m:r>
+              <m:t>F</m:t>
+            </m:r>
+          </m:e>
+          <m:sub>
+            <m:r>
+              <m:t>S</m:t>
+            </m:r>
+            <m:r>
+              <m:t>T</m:t>
+            </m:r>
+          </m:sub>
+        </m:sSub>
+      </m:oMath>
+      <w:r>
+        <w:t xml:space="preserve"> </w:t>
+      </w:r>
+      <w:r>
+        <w:t xml:space="preserve">sits at the neutral-drift expectation and far below the bounded-groups null (Figure 11). Williams’s southeast-Missouri phases, like the named phases of the St. Francis basin, are arbitrary divisions of a continuous field structured by geography and time. This is the same verdict Fox</w:t>
       </w:r>
       <w:r>
         <w:t xml:space="preserve"> </w:t>
@@ -1794,7 +2325,7 @@
         <w:t xml:space="preserve"> </w:t>
       </w:r>
       <w:r>
-        <w:t xml:space="preserve">is neutral copying, with an innovation rate that mixes in a uniform draw from the set of classes. An assemblage pools production over a window of generations, so the time-averaging that distorts the static statistics is built into the generative process rather than corrected after the fact. This is what makes the test both empirically and dynamically sufficient. We drew 40,000 parameter sets from broad priors (innovation rate, bias</w:t>
+        <w:t xml:space="preserve">is neutral copying, with an innovation rate that mixes in a uniform draw from the set of classes. An assemblage pools production over a window of generations, so the time-averaging that distorts the static statistics is built into the generative process rather than corrected after the fact. This is what makes the test both empirically and dynamically sufficient. We placed broad priors on the innovation rate, the bias</w:t>
       </w:r>
       <w:r>
         <w:t xml:space="preserve"> </w:t>
@@ -1805,7 +2336,16 @@
         </m:r>
       </m:oMath>
       <w:r>
-        <w:t xml:space="preserve">, population size, and time-averaging window) and simulated a six-bin sequence from each. We then accepted the 400 parameter sets closest to the observed diversity trajectory and rank-frequency profile, ranked by Euclidean distance over the summary statistics. The posterior of the bias is tightly constrained near neutral, with mean</w:t>
+        <w:t xml:space="preserve">, the population size, and the time-averaging window, and fit the model by sequential Monte Carlo approximate Bayesian computation, which advances a population of parameter sets through a sequence of shrinking distance tolerances and corrects the accepted values with a local-linear regression adjustment, matching each simulated six-bin sequence to the observed diversity trajectory and rank-frequency profile</w:t>
+      </w:r>
+      <w:r>
+        <w:t xml:space="preserve"> </w:t>
+      </w:r>
+      <w:r>
+        <w:t xml:space="preserve">(Beaumont et al. 2002; Toni et al. 2009)</w:t>
+      </w:r>
+      <w:r>
+        <w:t xml:space="preserve">. The posterior of the bias is tightly constrained near neutral, with mean</w:t>
       </w:r>
       <w:r>
         <w:t xml:space="preserve"> </w:t>
@@ -1827,7 +2367,7 @@
           <m:t>+</m:t>
         </m:r>
         <m:r>
-          <m:t>0.028</m:t>
+          <m:t>0.006</m:t>
         </m:r>
       </m:oMath>
       <w:r>
@@ -1847,7 +2387,7 @@
           <m:t>−</m:t>
         </m:r>
         <m:r>
-          <m:t>0.021</m:t>
+          <m:t>0.020</m:t>
         </m:r>
       </m:oMath>
       <w:r>
@@ -1867,14 +2407,14 @@
           <m:t>+</m:t>
         </m:r>
         <m:r>
-          <m:t>0.063</m:t>
+          <m:t>0.035</m:t>
         </m:r>
       </m:oMath>
       <w:r>
         <w:t xml:space="preserve"> </w:t>
       </w:r>
       <w:r>
-        <w:t xml:space="preserve">that includes zero (Figure S6A). The posterior standard deviation is 0.021 against a prior of 0.289, so the data appreciably constrain the bias rather than leaving it at the prior, placing it close to neutral. A weak conformist lean is visible, with</w:t>
+        <w:t xml:space="preserve">that includes zero (Figure S6A). The posterior standard deviation is 0.014 against a prior of 0.289, so the data strongly constrain the bias rather than leaving it at the prior. Any conformist lean is weak and unresolved, with</w:t>
       </w:r>
       <w:r>
         <w:t xml:space="preserve"> </w:t>
@@ -1914,11 +2454,20 @@
           <m:t>=</m:t>
         </m:r>
         <m:r>
-          <m:t>0.91</m:t>
+          <m:t>0.70</m:t>
         </m:r>
       </m:oMath>
       <w:r>
-        <w:t xml:space="preserve">, but it is not resolved as a departure from neutral. Refitting the bias separately to the early and late halves of the sequence recovers no shift between them. The inference rules out the strong conformist bias that a marker- or assortment-based dynamic would require by modeling copying dynamics rather than a single static moment. The posterior contraction should be interpreted with one caveat. Rejection sampling at a one percent acceptance tolerance is not formally calibrated here, so we present this inference as concordant with the record-matched recovery and the static signatures rather than as a standalone result.</w:t>
+        <w:t xml:space="preserve">, and refitting the bias separately to the early and late halves of the sequence recovers no shift between them. The inference rules out the strong conformist bias that a marker- or assortment-based dynamic would require by modeling copying dynamics rather than a single static moment. We validated the method by simulation-based calibration, fitting many datasets drawn from the prior and confirming that the rank of each true value within its posterior is uniform (Figure S6B)</w:t>
+      </w:r>
+      <w:r>
+        <w:t xml:space="preserve"> </w:t>
+      </w:r>
+      <w:r>
+        <w:t xml:space="preserve">(Talts et al. 2018)</w:t>
+      </w:r>
+      <w:r>
+        <w:t xml:space="preserve">. The calibrated posterior agrees with an independent rejection-sampling fit of the same model, so we report it as a standalone result rather than only as a concordance.</w:t>
       </w:r>
     </w:p>
     <w:p>
@@ -1935,7 +2484,7 @@
         <w:t xml:space="preserve">(Hunt 2006; Hunt et al. 2008)</w:t>
       </w:r>
       <w:r>
-        <w:t xml:space="preserve">. For the Gini-Simpson diversity trajectory and for the abundant decorated classes, binned along the oriented axis, we fit four time-series models on the same level vector: an unbiased random walk (Brownian motion, the neutral-drift expectation), a general biased random walk (the directional signature a sustained transition would leave), a stasis model (white noise about a constant mean), and an Ornstein-Uhlenbeck model (mean reversion toward an optimum). We compared them by the small-sample Akaike information criterion. The aggregate diversity trajectory favors the unbiased random walk, with an Akaike weight of 0.81 against 0.19 for the directional model and negligible weight for stasis or the Ornstein-Uhlenbeck model. The model comparison has only six points, so it is weak. This result is a concordance rather than a decisive selection (Figure S6B). The diversity trajectory is the trait of interest here, because the correspondence-analysis ordering does not arrange it by construction. Individual-class trajectories more often favor the directional model. That comparison, however, is weak and partly tautological because the seriation axis is designed to maximize monotonic class-frequency turnover, and only three classes are abundant enough across the sequence to fit. The robust conclusion is neutral drift, not a sustained directional transition.</w:t>
+        <w:t xml:space="preserve">. For the Gini-Simpson diversity trajectory and for the abundant decorated classes, binned along the oriented axis, we fit four time-series models on the same level vector: an unbiased random walk (Brownian motion, the neutral-drift expectation), a general biased random walk (the directional signature a sustained transition would leave), a stasis model (white noise about a constant mean), and an Ornstein-Uhlenbeck model (mean reversion toward an optimum). We compared them by the small-sample Akaike information criterion. The aggregate diversity trajectory favors the unbiased random walk, with an Akaike weight of 0.81 against 0.19 for the directional model and negligible weight for stasis or the Ornstein-Uhlenbeck model. The model comparison has only six points, so it is weak. This result is a concordance rather than a decisive selection (Figure S6C). The diversity trajectory is the trait of interest here, because the correspondence-analysis ordering does not arrange it by construction. Individual-class trajectories more often favor the directional model. That comparison, however, is weak and partly tautological because the seriation axis is designed to maximize monotonic class-frequency turnover, and only three classes are abundant enough across the sequence to fit. The robust conclusion is neutral drift, not a sustained directional transition.</w:t>
       </w:r>
     </w:p>
     <w:p>
@@ -1945,9 +2494,9 @@
       <w:r>
         <w:drawing>
           <wp:inline>
-            <wp:extent cx="5334000" cy="2794140"/>
+            <wp:extent cx="5334000" cy="2315145"/>
             <wp:effectExtent b="0" l="0" r="0" t="0"/>
-            <wp:docPr descr="Figure S6. Dynamic-sufficiency tests. (A) Posterior of the transmission-bias parameter b from the generative, time-averaging-aware inference (b = 0 neutral, b &gt; 0 conformist, b &lt; 0 anti-conformist). The whole-sequence posterior (filled) and the early- and late-half posteriors (outlines) are all tightly constrained near neutral and include zero, ruling out the strong conformity a marker dynamic would require. (B) Tempo-and-mode Akaike weights of the four time-series models (BM unbiased random walk, GRW directional walk, Stasis, OU mean reversion) for the Gini-Simpson diversity trajectory and averaged across the abundant class trajectories. The diversity trajectory, which the correspondence-analysis ordering does not arrange by construction, favors the unbiased random walk (neutral drift), a concordance rather than a decisive selection given only six points." title="" id="33" name="Picture"/>
+            <wp:docPr descr="Figure S6. Dynamic-sufficiency tests. (A) Posterior of the transmission-bias parameter b from the generative, time-averaging-aware inference, fit by sequential Monte Carlo approximate Bayesian computation (b = 0 neutral, b &gt; 0 conformist, b &lt; 0 anti-conformist). The whole-sequence posterior (filled) and the early- and late-half posteriors (outlines) are all tightly constrained near neutral and include zero, ruling out the strong conformity a marker dynamic would require. (B) Simulation-based calibration of that inference. Over many datasets drawn from the prior, the rank of the true bias within its posterior is uniform (dashed line the uniform expectation), so the posterior is calibrated rather than merely contracted. (C) Tempo-and-mode Akaike weights of the four time-series models (BM unbiased random walk, GRW directional walk, Stasis, OU mean reversion) for the Gini-Simpson diversity trajectory and averaged across the abundant class trajectories. The diversity trajectory, which the correspondence-analysis ordering does not arrange by construction, favors the unbiased random walk (neutral drift), a concordance rather than a decisive selection given only six points." title="" id="33" name="Picture"/>
             <a:graphic>
               <a:graphicData uri="http://schemas.openxmlformats.org/drawingml/2006/picture">
                 <pic:pic>
@@ -1966,7 +2515,7 @@
                   <pic:spPr bwMode="auto">
                     <a:xfrm>
                       <a:off x="0" y="0"/>
-                      <a:ext cx="5334000" cy="2794140"/>
+                      <a:ext cx="5334000" cy="2315145"/>
                     </a:xfrm>
                     <a:prstGeom prst="rect">
                       <a:avLst/>
@@ -2000,7 +2549,7 @@
         <w:t xml:space="preserve"> </w:t>
       </w:r>
       <w:r>
-        <w:t xml:space="preserve">Dynamic-sufficiency tests. (A) Posterior of the transmission-bias parameter b from the generative, time-averaging-aware inference (b = 0 neutral, b &gt; 0 conformist, b &lt; 0 anti-conformist). The whole-sequence posterior (filled) and the early- and late-half posteriors (outlines) are all tightly constrained near neutral and include zero, ruling out the strong conformity a marker dynamic would require. (B) Tempo-and-mode Akaike weights of the four time-series models (BM unbiased random walk, GRW directional walk, Stasis, OU mean reversion) for the Gini-Simpson diversity trajectory and averaged across the abundant class trajectories. The diversity trajectory, which the correspondence-analysis ordering does not arrange by construction, favors the unbiased random walk (neutral drift), a concordance rather than a decisive selection given only six points.</w:t>
+        <w:t xml:space="preserve">Dynamic-sufficiency tests. (A) Posterior of the transmission-bias parameter b from the generative, time-averaging-aware inference, fit by sequential Monte Carlo approximate Bayesian computation (b = 0 neutral, b &gt; 0 conformist, b &lt; 0 anti-conformist). The whole-sequence posterior (filled) and the early- and late-half posteriors (outlines) are all tightly constrained near neutral and include zero, ruling out the strong conformity a marker dynamic would require. (B) Simulation-based calibration of that inference. Over many datasets drawn from the prior, the rank of the true bias within its posterior is uniform (dashed line the uniform expectation), so the posterior is calibrated rather than merely contracted. (C) Tempo-and-mode Akaike weights of the four time-series models (BM unbiased random walk, GRW directional walk, Stasis, OU mean reversion) for the Gini-Simpson diversity trajectory and averaged across the abundant class trajectories. The diversity trajectory, which the correspondence-analysis ordering does not arrange by construction, favors the unbiased random walk (neutral drift), a concordance rather than a decisive selection given only six points.</w:t>
       </w:r>
     </w:p>
     <w:p>
@@ -2189,7 +2738,7 @@
       </w:r>
     </w:p>
     <w:bookmarkEnd w:id="39"/>
-    <w:bookmarkStart w:id="90" w:name="references"/>
+    <w:bookmarkStart w:id="96" w:name="references"/>
     <w:p>
       <w:pPr>
         <w:pStyle w:val="Heading2"/>
@@ -2198,8 +2747,46 @@
         <w:t xml:space="preserve">References</w:t>
       </w:r>
     </w:p>
-    <w:bookmarkStart w:id="89" w:name="refs"/>
-    <w:bookmarkStart w:id="41" w:name="ref-bell_richerson_mcelreath_2009"/>
+    <w:bookmarkStart w:id="95" w:name="refs"/>
+    <w:bookmarkStart w:id="40" w:name="ref-beaumont_zhang_balding_2002"/>
+    <w:p>
+      <w:pPr>
+        <w:pStyle w:val="Bibliography"/>
+      </w:pPr>
+      <w:r>
+        <w:t xml:space="preserve">Beaumont, Mark A., Wenyang Zhang, and David J. Balding. 2002. Approximate</w:t>
+      </w:r>
+      <w:r>
+        <w:t xml:space="preserve"> </w:t>
+      </w:r>
+      <w:r>
+        <w:t xml:space="preserve">Bayesian</w:t>
+      </w:r>
+      <w:r>
+        <w:t xml:space="preserve"> </w:t>
+      </w:r>
+      <w:r>
+        <w:t xml:space="preserve">Computation in Population Genetics.</w:t>
+      </w:r>
+      <w:r>
+        <w:t xml:space="preserve"> </w:t>
+      </w:r>
+      <w:r>
+        <w:rPr>
+          <w:i/>
+          <w:iCs/>
+        </w:rPr>
+        <w:t xml:space="preserve">Genetics</w:t>
+      </w:r>
+      <w:r>
+        <w:t xml:space="preserve"> </w:t>
+      </w:r>
+      <w:r>
+        <w:t xml:space="preserve">162(4):2025–2035.</w:t>
+      </w:r>
+    </w:p>
+    <w:bookmarkEnd w:id="40"/>
+    <w:bookmarkStart w:id="42" w:name="ref-bell_richerson_mcelreath_2009"/>
     <w:p>
       <w:pPr>
         <w:pStyle w:val="Bibliography"/>
@@ -2226,7 +2813,7 @@
       <w:r>
         <w:t xml:space="preserve"> </w:t>
       </w:r>
-      <w:hyperlink r:id="rId40">
+      <w:hyperlink r:id="rId41">
         <w:r>
           <w:rPr>
             <w:rStyle w:val="Hyperlink"/>
@@ -2238,8 +2825,8 @@
         <w:t xml:space="preserve">.</w:t>
       </w:r>
     </w:p>
-    <w:bookmarkEnd w:id="41"/>
-    <w:bookmarkStart w:id="43" w:name="ref-bentley_hahn_shennan_2004"/>
+    <w:bookmarkEnd w:id="42"/>
+    <w:bookmarkStart w:id="44" w:name="ref-bentley_hahn_shennan_2004"/>
     <w:p>
       <w:pPr>
         <w:pStyle w:val="Bibliography"/>
@@ -2266,7 +2853,7 @@
       <w:r>
         <w:t xml:space="preserve"> </w:t>
       </w:r>
-      <w:hyperlink r:id="rId42">
+      <w:hyperlink r:id="rId43">
         <w:r>
           <w:rPr>
             <w:rStyle w:val="Hyperlink"/>
@@ -2278,8 +2865,8 @@
         <w:t xml:space="preserve">.</w:t>
       </w:r>
     </w:p>
-    <w:bookmarkEnd w:id="43"/>
-    <w:bookmarkStart w:id="45" w:name="ref-carrignon_bentley_ruck_2019"/>
+    <w:bookmarkEnd w:id="44"/>
+    <w:bookmarkStart w:id="46" w:name="ref-carrignon_bentley_ruck_2019"/>
     <w:p>
       <w:pPr>
         <w:pStyle w:val="Bibliography"/>
@@ -2330,7 +2917,7 @@
       <w:r>
         <w:t xml:space="preserve"> </w:t>
       </w:r>
-      <w:hyperlink r:id="rId44">
+      <w:hyperlink r:id="rId45">
         <w:r>
           <w:rPr>
             <w:rStyle w:val="Hyperlink"/>
@@ -2342,8 +2929,8 @@
         <w:t xml:space="preserve">.</w:t>
       </w:r>
     </w:p>
-    <w:bookmarkEnd w:id="45"/>
-    <w:bookmarkStart w:id="46" w:name="ref-cowgill_1972"/>
+    <w:bookmarkEnd w:id="46"/>
+    <w:bookmarkStart w:id="47" w:name="ref-cowgill_1972"/>
     <w:p>
       <w:pPr>
         <w:pStyle w:val="Bibliography"/>
@@ -2365,8 +2952,8 @@
         <w:t xml:space="preserve">, edited by David L. Clarke, pp. 381–424. Methuen, London.</w:t>
       </w:r>
     </w:p>
-    <w:bookmarkEnd w:id="46"/>
-    <w:bookmarkStart w:id="48" w:name="ref-crema_edinborough_kerig_shennan_2014"/>
+    <w:bookmarkEnd w:id="47"/>
+    <w:bookmarkStart w:id="49" w:name="ref-crema_edinborough_kerig_shennan_2014"/>
     <w:p>
       <w:pPr>
         <w:pStyle w:val="Bibliography"/>
@@ -2405,7 +2992,7 @@
       <w:r>
         <w:t xml:space="preserve"> </w:t>
       </w:r>
-      <w:hyperlink r:id="rId47">
+      <w:hyperlink r:id="rId48">
         <w:r>
           <w:rPr>
             <w:rStyle w:val="Hyperlink"/>
@@ -2417,8 +3004,8 @@
         <w:t xml:space="preserve">.</w:t>
       </w:r>
     </w:p>
-    <w:bookmarkEnd w:id="48"/>
-    <w:bookmarkStart w:id="50" w:name="ref-crema_kandler_shennan_2016"/>
+    <w:bookmarkEnd w:id="49"/>
+    <w:bookmarkStart w:id="51" w:name="ref-crema_kandler_shennan_2016"/>
     <w:p>
       <w:pPr>
         <w:pStyle w:val="Bibliography"/>
@@ -2445,7 +3032,7 @@
       <w:r>
         <w:t xml:space="preserve"> </w:t>
       </w:r>
-      <w:hyperlink r:id="rId49">
+      <w:hyperlink r:id="rId50">
         <w:r>
           <w:rPr>
             <w:rStyle w:val="Hyperlink"/>
@@ -2457,8 +3044,8 @@
         <w:t xml:space="preserve">.</w:t>
       </w:r>
     </w:p>
-    <w:bookmarkEnd w:id="50"/>
-    <w:bookmarkStart w:id="52" w:name="ref-dakos_2012"/>
+    <w:bookmarkEnd w:id="51"/>
+    <w:bookmarkStart w:id="53" w:name="ref-dakos_2012"/>
     <w:p>
       <w:pPr>
         <w:pStyle w:val="Bibliography"/>
@@ -2485,7 +3072,7 @@
       <w:r>
         <w:t xml:space="preserve"> </w:t>
       </w:r>
-      <w:hyperlink r:id="rId51">
+      <w:hyperlink r:id="rId52">
         <w:r>
           <w:rPr>
             <w:rStyle w:val="Hyperlink"/>
@@ -2497,8 +3084,8 @@
         <w:t xml:space="preserve">.</w:t>
       </w:r>
     </w:p>
-    <w:bookmarkEnd w:id="52"/>
-    <w:bookmarkStart w:id="54" w:name="ref-dunnell_1970"/>
+    <w:bookmarkEnd w:id="53"/>
+    <w:bookmarkStart w:id="55" w:name="ref-dunnell_1970"/>
     <w:p>
       <w:pPr>
         <w:pStyle w:val="Bibliography"/>
@@ -2525,7 +3112,7 @@
       <w:r>
         <w:t xml:space="preserve"> </w:t>
       </w:r>
-      <w:hyperlink r:id="rId53">
+      <w:hyperlink r:id="rId54">
         <w:r>
           <w:rPr>
             <w:rStyle w:val="Hyperlink"/>
@@ -2537,8 +3124,8 @@
         <w:t xml:space="preserve">.</w:t>
       </w:r>
     </w:p>
-    <w:bookmarkEnd w:id="54"/>
-    <w:bookmarkStart w:id="55" w:name="ref-ewens_1972"/>
+    <w:bookmarkEnd w:id="55"/>
+    <w:bookmarkStart w:id="56" w:name="ref-ewens_1972"/>
     <w:p>
       <w:pPr>
         <w:pStyle w:val="Bibliography"/>
@@ -2563,8 +3150,8 @@
         <w:t xml:space="preserve">3(1):87–112.</w:t>
       </w:r>
     </w:p>
-    <w:bookmarkEnd w:id="55"/>
-    <w:bookmarkStart w:id="57" w:name="ref-feder_kryazhimskiy_plotkin_2014"/>
+    <w:bookmarkEnd w:id="56"/>
+    <w:bookmarkStart w:id="58" w:name="ref-feder_kryazhimskiy_plotkin_2014"/>
     <w:p>
       <w:pPr>
         <w:pStyle w:val="Bibliography"/>
@@ -2591,7 +3178,7 @@
       <w:r>
         <w:t xml:space="preserve"> </w:t>
       </w:r>
-      <w:hyperlink r:id="rId56">
+      <w:hyperlink r:id="rId57">
         <w:r>
           <w:rPr>
             <w:rStyle w:val="Hyperlink"/>
@@ -2603,8 +3190,8 @@
         <w:t xml:space="preserve">.</w:t>
       </w:r>
     </w:p>
-    <w:bookmarkEnd w:id="57"/>
-    <w:bookmarkStart w:id="58" w:name="ref-fox_1998"/>
+    <w:bookmarkEnd w:id="58"/>
+    <w:bookmarkStart w:id="59" w:name="ref-fox_1998"/>
     <w:p>
       <w:pPr>
         <w:pStyle w:val="Bibliography"/>
@@ -2626,8 +3213,8 @@
         <w:t xml:space="preserve">, edited by Michael J. O’Brien and Robert C. Dunnell, pp. 31–58. University of Alabama Press, Tuscaloosa.</w:t>
       </w:r>
     </w:p>
-    <w:bookmarkEnd w:id="58"/>
-    <w:bookmarkStart w:id="59" w:name="ref-graves_cachola-abad_1996"/>
+    <w:bookmarkEnd w:id="59"/>
+    <w:bookmarkStart w:id="60" w:name="ref-graves_cachola-abad_1996"/>
     <w:p>
       <w:pPr>
         <w:pStyle w:val="Bibliography"/>
@@ -2661,8 +3248,8 @@
         <w:t xml:space="preserve">31(1):19–32.</w:t>
       </w:r>
     </w:p>
-    <w:bookmarkEnd w:id="59"/>
-    <w:bookmarkStart w:id="61" w:name="ref-henrich_2001"/>
+    <w:bookmarkEnd w:id="60"/>
+    <w:bookmarkStart w:id="62" w:name="ref-henrich_2001"/>
     <w:p>
       <w:pPr>
         <w:pStyle w:val="Bibliography"/>
@@ -2689,7 +3276,7 @@
       <w:r>
         <w:t xml:space="preserve"> </w:t>
       </w:r>
-      <w:hyperlink r:id="rId60">
+      <w:hyperlink r:id="rId61">
         <w:r>
           <w:rPr>
             <w:rStyle w:val="Hyperlink"/>
@@ -2701,8 +3288,8 @@
         <w:t xml:space="preserve">.</w:t>
       </w:r>
     </w:p>
-    <w:bookmarkEnd w:id="61"/>
-    <w:bookmarkStart w:id="62" w:name="ref-hopkins_skellam_1954"/>
+    <w:bookmarkEnd w:id="62"/>
+    <w:bookmarkStart w:id="63" w:name="ref-hopkins_skellam_1954"/>
     <w:p>
       <w:pPr>
         <w:pStyle w:val="Bibliography"/>
@@ -2727,8 +3314,8 @@
         <w:t xml:space="preserve">18(2):213–227.</w:t>
       </w:r>
     </w:p>
-    <w:bookmarkEnd w:id="62"/>
-    <w:bookmarkStart w:id="64" w:name="ref-hunt_2006"/>
+    <w:bookmarkEnd w:id="63"/>
+    <w:bookmarkStart w:id="65" w:name="ref-hunt_2006"/>
     <w:p>
       <w:pPr>
         <w:pStyle w:val="Bibliography"/>
@@ -2755,7 +3342,7 @@
       <w:r>
         <w:t xml:space="preserve"> </w:t>
       </w:r>
-      <w:hyperlink r:id="rId63">
+      <w:hyperlink r:id="rId64">
         <w:r>
           <w:rPr>
             <w:rStyle w:val="Hyperlink"/>
@@ -2767,8 +3354,8 @@
         <w:t xml:space="preserve">.</w:t>
       </w:r>
     </w:p>
-    <w:bookmarkEnd w:id="64"/>
-    <w:bookmarkStart w:id="66" w:name="ref-hunt_bell_travis_2008"/>
+    <w:bookmarkEnd w:id="65"/>
+    <w:bookmarkStart w:id="67" w:name="ref-hunt_bell_travis_2008"/>
     <w:p>
       <w:pPr>
         <w:pStyle w:val="Bibliography"/>
@@ -2795,7 +3382,7 @@
       <w:r>
         <w:t xml:space="preserve"> </w:t>
       </w:r>
-      <w:hyperlink r:id="rId65">
+      <w:hyperlink r:id="rId66">
         <w:r>
           <w:rPr>
             <w:rStyle w:val="Hyperlink"/>
@@ -2807,8 +3394,8 @@
         <w:t xml:space="preserve">.</w:t>
       </w:r>
     </w:p>
-    <w:bookmarkEnd w:id="66"/>
-    <w:bookmarkStart w:id="68" w:name="ref-lipo_dinapoli_madsen_hunt_2021"/>
+    <w:bookmarkEnd w:id="67"/>
+    <w:bookmarkStart w:id="69" w:name="ref-lipo_dinapoli_madsen_hunt_2021"/>
     <w:p>
       <w:pPr>
         <w:pStyle w:val="Bibliography"/>
@@ -2835,7 +3422,7 @@
       <w:r>
         <w:t xml:space="preserve"> </w:t>
       </w:r>
-      <w:hyperlink r:id="rId67">
+      <w:hyperlink r:id="rId68">
         <w:r>
           <w:rPr>
             <w:rStyle w:val="Hyperlink"/>
@@ -2847,8 +3434,8 @@
         <w:t xml:space="preserve">.</w:t>
       </w:r>
     </w:p>
-    <w:bookmarkEnd w:id="68"/>
-    <w:bookmarkStart w:id="70" w:name="ref-lipo_madsen_dunnell_2015"/>
+    <w:bookmarkEnd w:id="69"/>
+    <w:bookmarkStart w:id="71" w:name="ref-lipo_madsen_dunnell_2015"/>
     <w:p>
       <w:pPr>
         <w:pStyle w:val="Bibliography"/>
@@ -2875,7 +3462,7 @@
       <w:r>
         <w:t xml:space="preserve"> </w:t>
       </w:r>
-      <w:hyperlink r:id="rId69">
+      <w:hyperlink r:id="rId70">
         <w:r>
           <w:rPr>
             <w:rStyle w:val="Hyperlink"/>
@@ -2887,8 +3474,8 @@
         <w:t xml:space="preserve">.</w:t>
       </w:r>
     </w:p>
-    <w:bookmarkEnd w:id="70"/>
-    <w:bookmarkStart w:id="72" w:name="ref-lipo_madsen_dunnell_hunt_1997"/>
+    <w:bookmarkEnd w:id="71"/>
+    <w:bookmarkStart w:id="73" w:name="ref-lipo_madsen_dunnell_hunt_1997"/>
     <w:p>
       <w:pPr>
         <w:pStyle w:val="Bibliography"/>
@@ -2915,7 +3502,7 @@
       <w:r>
         <w:t xml:space="preserve"> </w:t>
       </w:r>
-      <w:hyperlink r:id="rId71">
+      <w:hyperlink r:id="rId72">
         <w:r>
           <w:rPr>
             <w:rStyle w:val="Hyperlink"/>
@@ -2927,8 +3514,8 @@
         <w:t xml:space="preserve">.</w:t>
       </w:r>
     </w:p>
-    <w:bookmarkEnd w:id="72"/>
-    <w:bookmarkStart w:id="73" w:name="ref-lyman_obrien_2006"/>
+    <w:bookmarkEnd w:id="73"/>
+    <w:bookmarkStart w:id="74" w:name="ref-lyman_obrien_2006"/>
     <w:p>
       <w:pPr>
         <w:pStyle w:val="Bibliography"/>
@@ -2950,8 +3537,8 @@
         <w:t xml:space="preserve">. University of Nebraska Press, Lincoln.</w:t>
       </w:r>
     </w:p>
-    <w:bookmarkEnd w:id="73"/>
-    <w:bookmarkStart w:id="74" w:name="ref-mainfort_2001"/>
+    <w:bookmarkEnd w:id="74"/>
+    <w:bookmarkStart w:id="75" w:name="ref-mainfort_2001"/>
     <w:p>
       <w:pPr>
         <w:pStyle w:val="Bibliography"/>
@@ -2985,8 +3572,8 @@
         <w:t xml:space="preserve">, edited by David S. Brose, C. Wesley Cowan, and Jr. Mainfort Robert C., pp. 173–190. Smithsonian Institution Press, Washington, DC.</w:t>
       </w:r>
     </w:p>
-    <w:bookmarkEnd w:id="74"/>
-    <w:bookmarkStart w:id="75" w:name="ref-marquardt_1978"/>
+    <w:bookmarkEnd w:id="75"/>
+    <w:bookmarkStart w:id="76" w:name="ref-marquardt_1978"/>
     <w:p>
       <w:pPr>
         <w:pStyle w:val="Bibliography"/>
@@ -3008,8 +3595,8 @@
         <w:t xml:space="preserve">, edited by Michael B. Schiffer, pp. 257–314. Academic Press, New York.</w:t>
       </w:r>
     </w:p>
-    <w:bookmarkEnd w:id="75"/>
-    <w:bookmarkStart w:id="76" w:name="ref-neiman_1995"/>
+    <w:bookmarkEnd w:id="76"/>
+    <w:bookmarkStart w:id="77" w:name="ref-neiman_1995"/>
     <w:p>
       <w:pPr>
         <w:pStyle w:val="Bibliography"/>
@@ -3052,8 +3639,8 @@
         <w:t xml:space="preserve">60(1):7–36.</w:t>
       </w:r>
     </w:p>
-    <w:bookmarkEnd w:id="76"/>
-    <w:bookmarkStart w:id="77" w:name="ref-obrien_lyman_1999"/>
+    <w:bookmarkEnd w:id="77"/>
+    <w:bookmarkStart w:id="78" w:name="ref-obrien_lyman_1999"/>
     <w:p>
       <w:pPr>
         <w:pStyle w:val="Bibliography"/>
@@ -3075,8 +3662,8 @@
         <w:t xml:space="preserve">. Kluwer Academic/Plenum, New York.</w:t>
       </w:r>
     </w:p>
-    <w:bookmarkEnd w:id="77"/>
-    <w:bookmarkStart w:id="79" w:name="ref-reimer_etal_2020"/>
+    <w:bookmarkEnd w:id="78"/>
+    <w:bookmarkStart w:id="80" w:name="ref-reimer_etal_2020"/>
     <w:p>
       <w:pPr>
         <w:pStyle w:val="Bibliography"/>
@@ -3130,7 +3717,7 @@
       <w:r>
         <w:t xml:space="preserve"> </w:t>
       </w:r>
-      <w:hyperlink r:id="rId78">
+      <w:hyperlink r:id="rId79">
         <w:r>
           <w:rPr>
             <w:rStyle w:val="Hyperlink"/>
@@ -3142,8 +3729,8 @@
         <w:t xml:space="preserve">.</w:t>
       </w:r>
     </w:p>
-    <w:bookmarkEnd w:id="79"/>
-    <w:bookmarkStart w:id="80" w:name="ref-rousseeuw_1987"/>
+    <w:bookmarkEnd w:id="80"/>
+    <w:bookmarkStart w:id="81" w:name="ref-rousseeuw_1987"/>
     <w:p>
       <w:pPr>
         <w:pStyle w:val="Bibliography"/>
@@ -3168,8 +3755,69 @@
         <w:t xml:space="preserve">20:53–65.</w:t>
       </w:r>
     </w:p>
-    <w:bookmarkEnd w:id="80"/>
-    <w:bookmarkStart w:id="82" w:name="ref-scheffer_2009"/>
+    <w:bookmarkEnd w:id="81"/>
+    <w:bookmarkStart w:id="83" w:name="ref-salvatier_wiecki_fonnesbeck_2016"/>
+    <w:p>
+      <w:pPr>
+        <w:pStyle w:val="Bibliography"/>
+      </w:pPr>
+      <w:r>
+        <w:t xml:space="preserve">Salvatier, John, Thomas V. Wiecki, and Christopher Fonnesbeck. 2016. Probabilistic Programming in</w:t>
+      </w:r>
+      <w:r>
+        <w:t xml:space="preserve"> </w:t>
+      </w:r>
+      <w:r>
+        <w:t xml:space="preserve">Python</w:t>
+      </w:r>
+      <w:r>
+        <w:t xml:space="preserve"> </w:t>
+      </w:r>
+      <w:r>
+        <w:t xml:space="preserve">Using</w:t>
+      </w:r>
+      <w:r>
+        <w:t xml:space="preserve"> </w:t>
+      </w:r>
+      <w:r>
+        <w:t xml:space="preserve">PyMC3</w:t>
+      </w:r>
+      <w:r>
+        <w:t xml:space="preserve">.</w:t>
+      </w:r>
+      <w:r>
+        <w:t xml:space="preserve"> </w:t>
+      </w:r>
+      <w:r>
+        <w:rPr>
+          <w:i/>
+          <w:iCs/>
+        </w:rPr>
+        <w:t xml:space="preserve">PeerJ Computer Science</w:t>
+      </w:r>
+      <w:r>
+        <w:t xml:space="preserve"> </w:t>
+      </w:r>
+      <w:r>
+        <w:t xml:space="preserve">2:e55.</w:t>
+      </w:r>
+      <w:r>
+        <w:t xml:space="preserve"> </w:t>
+      </w:r>
+      <w:hyperlink r:id="rId82">
+        <w:r>
+          <w:rPr>
+            <w:rStyle w:val="Hyperlink"/>
+          </w:rPr>
+          <w:t xml:space="preserve">https://doi.org/10.7717/peerj-cs.55</w:t>
+        </w:r>
+      </w:hyperlink>
+      <w:r>
+        <w:t xml:space="preserve">.</w:t>
+      </w:r>
+    </w:p>
+    <w:bookmarkEnd w:id="83"/>
+    <w:bookmarkStart w:id="85" w:name="ref-scheffer_2009"/>
     <w:p>
       <w:pPr>
         <w:pStyle w:val="Bibliography"/>
@@ -3196,7 +3844,7 @@
       <w:r>
         <w:t xml:space="preserve"> </w:t>
       </w:r>
-      <w:hyperlink r:id="rId81">
+      <w:hyperlink r:id="rId84">
         <w:r>
           <w:rPr>
             <w:rStyle w:val="Hyperlink"/>
@@ -3208,8 +3856,8 @@
         <w:t xml:space="preserve">.</w:t>
       </w:r>
     </w:p>
-    <w:bookmarkEnd w:id="82"/>
-    <w:bookmarkStart w:id="84" w:name="ref-surovell_brantingham_2007"/>
+    <w:bookmarkEnd w:id="85"/>
+    <w:bookmarkStart w:id="87" w:name="ref-surovell_brantingham_2007"/>
     <w:p>
       <w:pPr>
         <w:pStyle w:val="Bibliography"/>
@@ -3236,7 +3884,7 @@
       <w:r>
         <w:t xml:space="preserve"> </w:t>
       </w:r>
-      <w:hyperlink r:id="rId83">
+      <w:hyperlink r:id="rId86">
         <w:r>
           <w:rPr>
             <w:rStyle w:val="Hyperlink"/>
@@ -3248,8 +3896,8 @@
         <w:t xml:space="preserve">.</w:t>
       </w:r>
     </w:p>
-    <w:bookmarkEnd w:id="84"/>
-    <w:bookmarkStart w:id="86" w:name="ref-surovell_etal_2009"/>
+    <w:bookmarkEnd w:id="87"/>
+    <w:bookmarkStart w:id="89" w:name="ref-surovell_etal_2009"/>
     <w:p>
       <w:pPr>
         <w:pStyle w:val="Bibliography"/>
@@ -3276,7 +3924,7 @@
       <w:r>
         <w:t xml:space="preserve"> </w:t>
       </w:r>
-      <w:hyperlink r:id="rId85">
+      <w:hyperlink r:id="rId88">
         <w:r>
           <w:rPr>
             <w:rStyle w:val="Hyperlink"/>
@@ -3288,8 +3936,43 @@
         <w:t xml:space="preserve">.</w:t>
       </w:r>
     </w:p>
-    <w:bookmarkEnd w:id="86"/>
-    <w:bookmarkStart w:id="87" w:name="ref-tibshirani_walther_hastie_2001"/>
+    <w:bookmarkEnd w:id="89"/>
+    <w:bookmarkStart w:id="90" w:name="ref-talts_etal_2018"/>
+    <w:p>
+      <w:pPr>
+        <w:pStyle w:val="Bibliography"/>
+      </w:pPr>
+      <w:r>
+        <w:t xml:space="preserve">Talts, Sean, Michael Betancourt, Daniel Simpson, Aki Vehtari, and Andrew Gelman. 2018. Validating</w:t>
+      </w:r>
+      <w:r>
+        <w:t xml:space="preserve"> </w:t>
+      </w:r>
+      <w:r>
+        <w:t xml:space="preserve">Bayesian</w:t>
+      </w:r>
+      <w:r>
+        <w:t xml:space="preserve"> </w:t>
+      </w:r>
+      <w:r>
+        <w:t xml:space="preserve">Inference Algorithms with Simulation-Based Calibration.</w:t>
+      </w:r>
+      <w:r>
+        <w:t xml:space="preserve"> </w:t>
+      </w:r>
+      <w:r>
+        <w:rPr>
+          <w:i/>
+          <w:iCs/>
+        </w:rPr>
+        <w:t xml:space="preserve">arXiv Preprint arXiv:1804.06788</w:t>
+      </w:r>
+      <w:r>
+        <w:t xml:space="preserve">.</w:t>
+      </w:r>
+    </w:p>
+    <w:bookmarkEnd w:id="90"/>
+    <w:bookmarkStart w:id="91" w:name="ref-tibshirani_walther_hastie_2001"/>
     <w:p>
       <w:pPr>
         <w:pStyle w:val="Bibliography"/>
@@ -3314,20 +3997,72 @@
         <w:t xml:space="preserve">63(2):411–423.</w:t>
       </w:r>
     </w:p>
-    <w:bookmarkEnd w:id="87"/>
-    <w:bookmarkStart w:id="88" w:name="ref-williams_1954"/>
+    <w:bookmarkEnd w:id="91"/>
+    <w:bookmarkStart w:id="93" w:name="ref-toni_etal_2009"/>
     <w:p>
       <w:pPr>
         <w:pStyle w:val="Bibliography"/>
       </w:pPr>
       <w:r>
+        <w:t xml:space="preserve">Toni, Tina, David Welch, Natalja Strelkowa, Andreas Ipsen, and Michael P. H. Stumpf. 2009. Approximate</w:t>
+      </w:r>
+      <w:r>
+        <w:t xml:space="preserve"> </w:t>
+      </w:r>
+      <w:r>
+        <w:t xml:space="preserve">Bayesian</w:t>
+      </w:r>
+      <w:r>
+        <w:t xml:space="preserve"> </w:t>
+      </w:r>
+      <w:r>
+        <w:t xml:space="preserve">Computation Scheme for Parameter Inference and Model Selection in Dynamical Systems.</w:t>
+      </w:r>
+      <w:r>
+        <w:t xml:space="preserve"> </w:t>
+      </w:r>
+      <w:r>
+        <w:rPr>
+          <w:i/>
+          <w:iCs/>
+        </w:rPr>
+        <w:t xml:space="preserve">Journal of the Royal Society Interface</w:t>
+      </w:r>
+      <w:r>
+        <w:t xml:space="preserve"> </w:t>
+      </w:r>
+      <w:r>
+        <w:t xml:space="preserve">6(31):187–202.</w:t>
+      </w:r>
+      <w:r>
+        <w:t xml:space="preserve"> </w:t>
+      </w:r>
+      <w:hyperlink r:id="rId92">
+        <w:r>
+          <w:rPr>
+            <w:rStyle w:val="Hyperlink"/>
+          </w:rPr>
+          <w:t xml:space="preserve">https://doi.org/10.1098/rsif.2008.0172</w:t>
+        </w:r>
+      </w:hyperlink>
+      <w:r>
+        <w:t xml:space="preserve">.</w:t>
+      </w:r>
+    </w:p>
+    <w:bookmarkEnd w:id="93"/>
+    <w:bookmarkStart w:id="94" w:name="ref-williams_1954"/>
+    <w:p>
+      <w:pPr>
+        <w:pStyle w:val="Bibliography"/>
+      </w:pPr>
+      <w:r>
         <w:t xml:space="preserve">Williams, Stephen. 1954. An Archeological Study of the Mississippian Culture in Southeast Missouri. PhD thesis, Yale University, New Haven.</w:t>
       </w:r>
     </w:p>
-    <w:bookmarkEnd w:id="88"/>
-    <w:bookmarkEnd w:id="89"/>
-    <w:bookmarkEnd w:id="90"/>
-    <w:bookmarkEnd w:id="91"/>
+    <w:bookmarkEnd w:id="94"/>
+    <w:bookmarkEnd w:id="95"/>
+    <w:bookmarkEnd w:id="96"/>
+    <w:bookmarkEnd w:id="97"/>
     <w:sectPr>
       <w:footnotePr>
         <w:numRestart w:val="eachSect"/>

</xml_diff>

<commit_message>
Sync Supplemental: basin 14C robustness note (Alvey compilation, Mitchem 2017 cross-post)
Add the chronology robustness sentence and the Mitchem 2017 Parkin cross-post
citation from mls-emergence. The Alvey personal-communication dataset and the
robustness script are intentionally NOT included in this public repo; the
manuscript cites Alvey as a personal communication. Supplemental docx/pdf rebuilt.
</commit_message>
<xml_diff>
--- a/docs/manuscript/SUPPLEMENTAL_TEXT.docx
+++ b/docs/manuscript/SUPPLEMENTAL_TEXT.docx
@@ -2,7 +2,7 @@
 <file path=word/document.xml><?xml version="1.0" encoding="utf-8"?>
 <w:document xmlns:w="http://schemas.openxmlformats.org/wordprocessingml/2006/main" xmlns:m="http://schemas.openxmlformats.org/officeDocument/2006/math" xmlns:r="http://schemas.openxmlformats.org/officeDocument/2006/relationships" xmlns:o="urn:schemas-microsoft-com:office:office" xmlns:v="urn:schemas-microsoft-com:vml" xmlns:w10="urn:schemas-microsoft-com:office:word" xmlns:a="http://schemas.openxmlformats.org/drawingml/2006/main" xmlns:pic="http://schemas.openxmlformats.org/drawingml/2006/picture" xmlns:wp="http://schemas.openxmlformats.org/drawingml/2006/wordprocessingDrawing">
   <w:body>
-    <w:bookmarkStart w:id="195" w:name="supplemental-material"/>
+    <w:bookmarkStart w:id="196" w:name="supplemental-material"/>
     <w:p>
       <w:pPr>
         <w:pStyle w:val="Heading1"/>
@@ -2666,7 +2666,16 @@
         <w:t xml:space="preserve">(Surovell et al. 2009; Surovell and Brantingham 2007)</w:t>
       </w:r>
       <w:r>
-        <w:t xml:space="preserve">. To test the assumption that the seriation axis tracks calendar time, we pooled the dates of the five proveniences matching curated assemblages. We correlated their pooled median calibrated ages with CA1 position: Spearman’s r = +0.70 (n = 5, 27 dates pooled), with four sites in calendar order and one late-dated site, Clay Hill, departing from it. The orientation of the axis toward later time is supported but not certain, and we treat directional statements as provisional throughout.</w:t>
+        <w:t xml:space="preserve">. To test the assumption that the seriation axis tracks calendar time, we pooled the dates of the five proveniences matching curated assemblages. We correlated their pooled median calibrated ages with CA1 position: Spearman’s r = +0.70 (n = 5, 27 dates pooled), with four sites in calendar order and one late-dated site, Clay Hill, departing from it. The orientation of the axis toward later time is supported but not certain, and we treat directional statements as provisional throughout. The basin chronology is stable under an alternative compilation. Augmenting the Mainfort determinations with the net-new Mississippian dates in the broader lower-valley radiocarbon database compiled by Jeffrey Alvey (personal communication, 2022), twelve determinations concentrated at Hazel and Upper Nodena, shifts the summed-probability median by only eleven years, to AD 1433. The contact-truncation pattern and the CA1-calendar correlation are unchanged (Spearman +0.70). Recent AMS re-dating of the Parkin platform-mound post, interpreted as the base of the cross the De Soto expedition raised at Casqui, independently places it at cal AD 1445 to 1650</w:t>
+      </w:r>
+      <w:r>
+        <w:t xml:space="preserve"> </w:t>
+      </w:r>
+      <w:r>
+        <w:t xml:space="preserve">(Mitchem 2017)</w:t>
+      </w:r>
+      <w:r>
+        <w:t xml:space="preserve">, consistent with the terminal occupation inferred here.</w:t>
       </w:r>
     </w:p>
     <w:p>
@@ -2735,7 +2744,7 @@
       </w:r>
     </w:p>
     <w:bookmarkEnd w:id="139"/>
-    <w:bookmarkStart w:id="194" w:name="references"/>
+    <w:bookmarkStart w:id="195" w:name="references"/>
     <w:p>
       <w:pPr>
         <w:pStyle w:val="Heading2"/>
@@ -2744,7 +2753,7 @@
         <w:t xml:space="preserve">References</w:t>
       </w:r>
     </w:p>
-    <w:bookmarkStart w:id="193" w:name="refs"/>
+    <w:bookmarkStart w:id="194" w:name="refs"/>
     <w:bookmarkStart w:id="140" w:name="ref-beaumont_zhang_balding_2002"/>
     <w:p>
       <w:pPr>
@@ -3593,7 +3602,59 @@
       </w:r>
     </w:p>
     <w:bookmarkEnd w:id="176"/>
-    <w:bookmarkStart w:id="177" w:name="ref-neiman_1995"/>
+    <w:bookmarkStart w:id="177" w:name="ref-mitchem_2017"/>
+    <w:p>
+      <w:pPr>
+        <w:pStyle w:val="Bibliography"/>
+      </w:pPr>
+      <w:r>
+        <w:t xml:space="preserve">Mitchem, Jeffrey M. 2017. Making the Case for the</w:t>
+      </w:r>
+      <w:r>
+        <w:t xml:space="preserve"> </w:t>
+      </w:r>
+      <w:r>
+        <w:t xml:space="preserve">Parkin</w:t>
+      </w:r>
+      <w:r>
+        <w:t xml:space="preserve"> </w:t>
+      </w:r>
+      <w:r>
+        <w:t xml:space="preserve">Site as</w:t>
+      </w:r>
+      <w:r>
+        <w:t xml:space="preserve"> </w:t>
+      </w:r>
+      <w:r>
+        <w:t xml:space="preserve">Casqui</w:t>
+      </w:r>
+      <w:r>
+        <w:t xml:space="preserve">:</w:t>
+      </w:r>
+      <w:r>
+        <w:t xml:space="preserve"> </w:t>
+      </w:r>
+      <w:r>
+        <w:t xml:space="preserve">Hernando</w:t>
+      </w:r>
+      <w:r>
+        <w:t xml:space="preserve"> </w:t>
+      </w:r>
+      <w:r>
+        <w:t xml:space="preserve">de</w:t>
+      </w:r>
+      <w:r>
+        <w:t xml:space="preserve"> </w:t>
+      </w:r>
+      <w:r>
+        <w:t xml:space="preserve">Soto</w:t>
+      </w:r>
+      <w:r>
+        <w:t xml:space="preserve">’s 1541 Cross.</w:t>
+      </w:r>
+    </w:p>
+    <w:bookmarkEnd w:id="177"/>
+    <w:bookmarkStart w:id="178" w:name="ref-neiman_1995"/>
     <w:p>
       <w:pPr>
         <w:pStyle w:val="Bibliography"/>
@@ -3636,8 +3697,8 @@
         <w:t xml:space="preserve">60(1):7–36.</w:t>
       </w:r>
     </w:p>
-    <w:bookmarkEnd w:id="177"/>
-    <w:bookmarkStart w:id="178" w:name="ref-obrien_lyman_1999"/>
+    <w:bookmarkEnd w:id="178"/>
+    <w:bookmarkStart w:id="179" w:name="ref-obrien_lyman_1999"/>
     <w:p>
       <w:pPr>
         <w:pStyle w:val="Bibliography"/>
@@ -3659,8 +3720,8 @@
         <w:t xml:space="preserve">. Kluwer Academic/Plenum, New York.</w:t>
       </w:r>
     </w:p>
-    <w:bookmarkEnd w:id="178"/>
-    <w:bookmarkStart w:id="180" w:name="ref-reimer_etal_2020"/>
+    <w:bookmarkEnd w:id="179"/>
+    <w:bookmarkStart w:id="181" w:name="ref-reimer_etal_2020"/>
     <w:p>
       <w:pPr>
         <w:pStyle w:val="Bibliography"/>
@@ -3714,7 +3775,7 @@
       <w:r>
         <w:t xml:space="preserve"> </w:t>
       </w:r>
-      <w:hyperlink r:id="rId179">
+      <w:hyperlink r:id="rId180">
         <w:r>
           <w:rPr>
             <w:rStyle w:val="Hyperlink"/>
@@ -3726,8 +3787,8 @@
         <w:t xml:space="preserve">.</w:t>
       </w:r>
     </w:p>
-    <w:bookmarkEnd w:id="180"/>
-    <w:bookmarkStart w:id="181" w:name="ref-rousseeuw_1987"/>
+    <w:bookmarkEnd w:id="181"/>
+    <w:bookmarkStart w:id="182" w:name="ref-rousseeuw_1987"/>
     <w:p>
       <w:pPr>
         <w:pStyle w:val="Bibliography"/>
@@ -3752,8 +3813,8 @@
         <w:t xml:space="preserve">20:53–65.</w:t>
       </w:r>
     </w:p>
-    <w:bookmarkEnd w:id="181"/>
-    <w:bookmarkStart w:id="183" w:name="ref-scheffer_2009"/>
+    <w:bookmarkEnd w:id="182"/>
+    <w:bookmarkStart w:id="184" w:name="ref-scheffer_2009"/>
     <w:p>
       <w:pPr>
         <w:pStyle w:val="Bibliography"/>
@@ -3780,7 +3841,7 @@
       <w:r>
         <w:t xml:space="preserve"> </w:t>
       </w:r>
-      <w:hyperlink r:id="rId182">
+      <w:hyperlink r:id="rId183">
         <w:r>
           <w:rPr>
             <w:rStyle w:val="Hyperlink"/>
@@ -3792,8 +3853,8 @@
         <w:t xml:space="preserve">.</w:t>
       </w:r>
     </w:p>
-    <w:bookmarkEnd w:id="183"/>
-    <w:bookmarkStart w:id="185" w:name="ref-surovell_brantingham_2007"/>
+    <w:bookmarkEnd w:id="184"/>
+    <w:bookmarkStart w:id="186" w:name="ref-surovell_brantingham_2007"/>
     <w:p>
       <w:pPr>
         <w:pStyle w:val="Bibliography"/>
@@ -3820,7 +3881,7 @@
       <w:r>
         <w:t xml:space="preserve"> </w:t>
       </w:r>
-      <w:hyperlink r:id="rId184">
+      <w:hyperlink r:id="rId185">
         <w:r>
           <w:rPr>
             <w:rStyle w:val="Hyperlink"/>
@@ -3832,8 +3893,8 @@
         <w:t xml:space="preserve">.</w:t>
       </w:r>
     </w:p>
-    <w:bookmarkEnd w:id="185"/>
-    <w:bookmarkStart w:id="187" w:name="ref-surovell_etal_2009"/>
+    <w:bookmarkEnd w:id="186"/>
+    <w:bookmarkStart w:id="188" w:name="ref-surovell_etal_2009"/>
     <w:p>
       <w:pPr>
         <w:pStyle w:val="Bibliography"/>
@@ -3860,7 +3921,7 @@
       <w:r>
         <w:t xml:space="preserve"> </w:t>
       </w:r>
-      <w:hyperlink r:id="rId186">
+      <w:hyperlink r:id="rId187">
         <w:r>
           <w:rPr>
             <w:rStyle w:val="Hyperlink"/>
@@ -3872,8 +3933,8 @@
         <w:t xml:space="preserve">.</w:t>
       </w:r>
     </w:p>
-    <w:bookmarkEnd w:id="187"/>
-    <w:bookmarkStart w:id="188" w:name="ref-talts_etal_2018"/>
+    <w:bookmarkEnd w:id="188"/>
+    <w:bookmarkStart w:id="189" w:name="ref-talts_etal_2018"/>
     <w:p>
       <w:pPr>
         <w:pStyle w:val="Bibliography"/>
@@ -3907,8 +3968,8 @@
         <w:t xml:space="preserve">.</w:t>
       </w:r>
     </w:p>
-    <w:bookmarkEnd w:id="188"/>
-    <w:bookmarkStart w:id="189" w:name="ref-tibshirani_walther_hastie_2001"/>
+    <w:bookmarkEnd w:id="189"/>
+    <w:bookmarkStart w:id="190" w:name="ref-tibshirani_walther_hastie_2001"/>
     <w:p>
       <w:pPr>
         <w:pStyle w:val="Bibliography"/>
@@ -3933,8 +3994,8 @@
         <w:t xml:space="preserve">63(2):411–423.</w:t>
       </w:r>
     </w:p>
-    <w:bookmarkEnd w:id="189"/>
-    <w:bookmarkStart w:id="191" w:name="ref-toni_etal_2009"/>
+    <w:bookmarkEnd w:id="190"/>
+    <w:bookmarkStart w:id="192" w:name="ref-toni_etal_2009"/>
     <w:p>
       <w:pPr>
         <w:pStyle w:val="Bibliography"/>
@@ -3973,7 +4034,7 @@
       <w:r>
         <w:t xml:space="preserve"> </w:t>
       </w:r>
-      <w:hyperlink r:id="rId190">
+      <w:hyperlink r:id="rId191">
         <w:r>
           <w:rPr>
             <w:rStyle w:val="Hyperlink"/>
@@ -3985,8 +4046,8 @@
         <w:t xml:space="preserve">.</w:t>
       </w:r>
     </w:p>
-    <w:bookmarkEnd w:id="191"/>
-    <w:bookmarkStart w:id="192" w:name="ref-williams_1954"/>
+    <w:bookmarkEnd w:id="192"/>
+    <w:bookmarkStart w:id="193" w:name="ref-williams_1954"/>
     <w:p>
       <w:pPr>
         <w:pStyle w:val="Bibliography"/>
@@ -3995,10 +4056,10 @@
         <w:t xml:space="preserve">Williams, Stephen. 1954. An Archeological Study of the Mississippian Culture in Southeast Missouri. PhD thesis, Yale University, New Haven.</w:t>
       </w:r>
     </w:p>
-    <w:bookmarkEnd w:id="192"/>
     <w:bookmarkEnd w:id="193"/>
     <w:bookmarkEnd w:id="194"/>
     <w:bookmarkEnd w:id="195"/>
+    <w:bookmarkEnd w:id="196"/>
     <w:sectPr>
       <w:footerReference r:id="rId100" w:type="default"/>
       <w:footnotePr>

</xml_diff>